<commit_message>
Fix Table 9/10 (GARCH comparison, threshold sensitivity): recompute with leakage-safe pre-test protocol, drop unverifiable P1 replication row
</commit_message>
<xml_diff>
--- a/Manuscript/Major_Revision_02_/Manuscript_26082026.docx
+++ b/Manuscript/Major_Revision_02_/Manuscript_26082026.docx
@@ -6762,14 +6762,7 @@
             <w:vAlign w:val="center"/>
           </w:tcPr>
           <w:p>
-            <w:pPr>
-              <w:jc w:val="center"/>
-            </w:pPr>
-            <w:r>
-              <w:rPr>
-                <w:b/>
-                <w:sz w:val="20"/>
-              </w:rPr>
+            <w:r>
               <w:t>Regime</w:t>
             </w:r>
           </w:p>
@@ -6780,14 +6773,7 @@
             <w:vAlign w:val="center"/>
           </w:tcPr>
           <w:p>
-            <w:pPr>
-              <w:jc w:val="center"/>
-            </w:pPr>
-            <w:r>
-              <w:rPr>
-                <w:b/>
-                <w:sz w:val="20"/>
-              </w:rPr>
+            <w:r>
               <w:t>n</w:t>
             </w:r>
           </w:p>
@@ -6798,14 +6784,7 @@
             <w:vAlign w:val="center"/>
           </w:tcPr>
           <w:p>
-            <w:pPr>
-              <w:jc w:val="center"/>
-            </w:pPr>
-            <w:r>
-              <w:rPr>
-                <w:b/>
-                <w:sz w:val="20"/>
-              </w:rPr>
+            <w:r>
               <w:t>Accuracy</w:t>
             </w:r>
           </w:p>
@@ -6816,14 +6795,7 @@
             <w:vAlign w:val="center"/>
           </w:tcPr>
           <w:p>
-            <w:pPr>
-              <w:jc w:val="center"/>
-            </w:pPr>
-            <w:r>
-              <w:rPr>
-                <w:b/>
-                <w:sz w:val="20"/>
-              </w:rPr>
+            <w:r>
               <w:t>Fisher p</w:t>
             </w:r>
           </w:p>
@@ -6834,18 +6806,8 @@
             <w:vAlign w:val="center"/>
           </w:tcPr>
           <w:p>
-            <w:pPr>
-              <w:jc w:val="center"/>
-            </w:pPr>
-            <w:r>
-              <w:rPr>
-                <w:b/>
-                <w:sz w:val="20"/>
-              </w:rPr>
-              <w:t>Phi (</w:t>
-            </w:r>
-            <w:r>
-              <w:t>φ)</w:t>
+            <w:r>
+              <w:t>Phi (φ)</w:t>
             </w:r>
           </w:p>
         </w:tc>
@@ -6855,14 +6817,7 @@
             <w:vAlign w:val="center"/>
           </w:tcPr>
           <w:p>
-            <w:pPr>
-              <w:jc w:val="center"/>
-            </w:pPr>
-            <w:r>
-              <w:rPr>
-                <w:b/>
-                <w:sz w:val="20"/>
-              </w:rPr>
+            <w:r>
               <w:t>Bonferroni pass</w:t>
             </w:r>
           </w:p>
@@ -6879,14 +6834,8 @@
             <w:vAlign w:val="center"/>
           </w:tcPr>
           <w:p>
-            <w:pPr>
-              <w:jc w:val="center"/>
-            </w:pPr>
-            <w:r>
-              <w:rPr>
-                <w:sz w:val="20"/>
-              </w:rPr>
-              <w:t>VIX High (≥ 18.71)</w:t>
+            <w:r>
+              <w:t>VIX High (&gt;= 18.71)</w:t>
             </w:r>
           </w:p>
         </w:tc>
@@ -6896,13 +6845,7 @@
             <w:vAlign w:val="center"/>
           </w:tcPr>
           <w:p>
-            <w:pPr>
-              <w:jc w:val="center"/>
-            </w:pPr>
-            <w:r>
-              <w:rPr>
-                <w:sz w:val="20"/>
-              </w:rPr>
+            <w:r>
               <w:t>8</w:t>
             </w:r>
           </w:p>
@@ -6913,13 +6856,7 @@
             <w:vAlign w:val="center"/>
           </w:tcPr>
           <w:p>
-            <w:pPr>
-              <w:jc w:val="center"/>
-            </w:pPr>
-            <w:r>
-              <w:rPr>
-                <w:sz w:val="20"/>
-              </w:rPr>
+            <w:r>
               <w:t>100.0%</w:t>
             </w:r>
           </w:p>
@@ -6930,13 +6867,7 @@
             <w:vAlign w:val="center"/>
           </w:tcPr>
           <w:p>
-            <w:pPr>
-              <w:jc w:val="center"/>
-            </w:pPr>
-            <w:r>
-              <w:rPr>
-                <w:sz w:val="20"/>
-              </w:rPr>
+            <w:r>
               <w:t>1.000</w:t>
             </w:r>
           </w:p>
@@ -6947,13 +6878,7 @@
             <w:vAlign w:val="center"/>
           </w:tcPr>
           <w:p>
-            <w:pPr>
-              <w:jc w:val="center"/>
-            </w:pPr>
-            <w:r>
-              <w:rPr>
-                <w:sz w:val="20"/>
-              </w:rPr>
+            <w:r>
               <w:t>N/A</w:t>
             </w:r>
           </w:p>
@@ -6964,13 +6889,7 @@
             <w:vAlign w:val="center"/>
           </w:tcPr>
           <w:p>
-            <w:pPr>
-              <w:jc w:val="center"/>
-            </w:pPr>
-            <w:r>
-              <w:rPr>
-                <w:sz w:val="20"/>
-              </w:rPr>
+            <w:r>
               <w:t>No</w:t>
             </w:r>
           </w:p>
@@ -6987,13 +6906,7 @@
             <w:vAlign w:val="center"/>
           </w:tcPr>
           <w:p>
-            <w:pPr>
-              <w:jc w:val="center"/>
-            </w:pPr>
-            <w:r>
-              <w:rPr>
-                <w:sz w:val="20"/>
-              </w:rPr>
+            <w:r>
               <w:t>VIX Low</w:t>
             </w:r>
           </w:p>
@@ -7004,13 +6917,7 @@
             <w:vAlign w:val="center"/>
           </w:tcPr>
           <w:p>
-            <w:pPr>
-              <w:jc w:val="center"/>
-            </w:pPr>
-            <w:r>
-              <w:rPr>
-                <w:sz w:val="20"/>
-              </w:rPr>
+            <w:r>
               <w:t>248</w:t>
             </w:r>
           </w:p>
@@ -7021,13 +6928,7 @@
             <w:vAlign w:val="center"/>
           </w:tcPr>
           <w:p>
-            <w:pPr>
-              <w:jc w:val="center"/>
-            </w:pPr>
-            <w:r>
-              <w:rPr>
-                <w:sz w:val="20"/>
-              </w:rPr>
+            <w:r>
               <w:t>66.5%</w:t>
             </w:r>
           </w:p>
@@ -7038,13 +6939,7 @@
             <w:vAlign w:val="center"/>
           </w:tcPr>
           <w:p>
-            <w:pPr>
-              <w:jc w:val="center"/>
-            </w:pPr>
-            <w:r>
-              <w:rPr>
-                <w:sz w:val="20"/>
-              </w:rPr>
+            <w:r>
               <w:t>—</w:t>
             </w:r>
           </w:p>
@@ -7055,13 +6950,7 @@
             <w:vAlign w:val="center"/>
           </w:tcPr>
           <w:p>
-            <w:pPr>
-              <w:jc w:val="center"/>
-            </w:pPr>
-            <w:r>
-              <w:rPr>
-                <w:sz w:val="20"/>
-              </w:rPr>
+            <w:r>
               <w:t>—</w:t>
             </w:r>
           </w:p>
@@ -7072,13 +6961,7 @@
             <w:vAlign w:val="center"/>
           </w:tcPr>
           <w:p>
-            <w:pPr>
-              <w:jc w:val="center"/>
-            </w:pPr>
-            <w:r>
-              <w:rPr>
-                <w:sz w:val="20"/>
-              </w:rPr>
+            <w:r>
               <w:t>—</w:t>
             </w:r>
           </w:p>
@@ -7095,14 +6978,8 @@
             <w:vAlign w:val="center"/>
           </w:tcPr>
           <w:p>
-            <w:pPr>
-              <w:jc w:val="center"/>
-            </w:pPr>
-            <w:r>
-              <w:rPr>
-                <w:sz w:val="20"/>
-              </w:rPr>
-              <w:t>GARCH High (p75)</w:t>
+            <w:r>
+              <w:t>GARCH High (&gt;= 1.3851, pre-test p75)</w:t>
             </w:r>
           </w:p>
         </w:tc>
@@ -7112,14 +6989,8 @@
             <w:vAlign w:val="center"/>
           </w:tcPr>
           <w:p>
-            <w:pPr>
-              <w:jc w:val="center"/>
-            </w:pPr>
-            <w:r>
-              <w:rPr>
-                <w:sz w:val="20"/>
-              </w:rPr>
-              <w:t>70</w:t>
+            <w:r>
+              <w:t>10</w:t>
             </w:r>
           </w:p>
         </w:tc>
@@ -7129,14 +7000,8 @@
             <w:vAlign w:val="center"/>
           </w:tcPr>
           <w:p>
-            <w:pPr>
-              <w:jc w:val="center"/>
-            </w:pPr>
-            <w:r>
-              <w:rPr>
-                <w:sz w:val="20"/>
-              </w:rPr>
-              <w:t>71.4%</w:t>
+            <w:r>
+              <w:t>80.0%</w:t>
             </w:r>
           </w:p>
         </w:tc>
@@ -7146,14 +7011,8 @@
             <w:vAlign w:val="center"/>
           </w:tcPr>
           <w:p>
-            <w:pPr>
-              <w:jc w:val="center"/>
-            </w:pPr>
-            <w:r>
-              <w:rPr>
-                <w:sz w:val="20"/>
-              </w:rPr>
-              <w:t>3.9×10⁻²</w:t>
+            <w:r>
+              <w:t>1.000</w:t>
             </w:r>
           </w:p>
         </w:tc>
@@ -7163,14 +7022,8 @@
             <w:vAlign w:val="center"/>
           </w:tcPr>
           <w:p>
-            <w:pPr>
-              <w:jc w:val="center"/>
-            </w:pPr>
-            <w:r>
-              <w:rPr>
-                <w:sz w:val="20"/>
-              </w:rPr>
-              <w:t>0.124</w:t>
+            <w:r>
+              <w:t>N/A</w:t>
             </w:r>
           </w:p>
         </w:tc>
@@ -7180,13 +7033,7 @@
             <w:vAlign w:val="center"/>
           </w:tcPr>
           <w:p>
-            <w:pPr>
-              <w:jc w:val="center"/>
-            </w:pPr>
-            <w:r>
-              <w:rPr>
-                <w:sz w:val="20"/>
-              </w:rPr>
+            <w:r>
               <w:t>No</w:t>
             </w:r>
           </w:p>
@@ -7203,13 +7050,7 @@
             <w:vAlign w:val="center"/>
           </w:tcPr>
           <w:p>
-            <w:pPr>
-              <w:jc w:val="center"/>
-            </w:pPr>
-            <w:r>
-              <w:rPr>
-                <w:sz w:val="20"/>
-              </w:rPr>
+            <w:r>
               <w:t>GARCH Low</w:t>
             </w:r>
           </w:p>
@@ -7220,14 +7061,8 @@
             <w:vAlign w:val="center"/>
           </w:tcPr>
           <w:p>
-            <w:pPr>
-              <w:jc w:val="center"/>
-            </w:pPr>
-            <w:r>
-              <w:rPr>
-                <w:sz w:val="20"/>
-              </w:rPr>
-              <w:t>207</w:t>
+            <w:r>
+              <w:t>246</w:t>
             </w:r>
           </w:p>
         </w:tc>
@@ -7237,14 +7072,8 @@
             <w:vAlign w:val="center"/>
           </w:tcPr>
           <w:p>
-            <w:pPr>
-              <w:jc w:val="center"/>
-            </w:pPr>
-            <w:r>
-              <w:rPr>
-                <w:sz w:val="20"/>
-              </w:rPr>
-              <w:t>57.5%</w:t>
+            <w:r>
+              <w:t>67.1%</w:t>
             </w:r>
           </w:p>
         </w:tc>
@@ -7254,13 +7083,7 @@
             <w:vAlign w:val="center"/>
           </w:tcPr>
           <w:p>
-            <w:pPr>
-              <w:jc w:val="center"/>
-            </w:pPr>
-            <w:r>
-              <w:rPr>
-                <w:sz w:val="20"/>
-              </w:rPr>
+            <w:r>
               <w:t>-</w:t>
             </w:r>
           </w:p>
@@ -7271,13 +7094,7 @@
             <w:vAlign w:val="center"/>
           </w:tcPr>
           <w:p>
-            <w:pPr>
-              <w:jc w:val="center"/>
-            </w:pPr>
-            <w:r>
-              <w:rPr>
-                <w:sz w:val="20"/>
-              </w:rPr>
+            <w:r>
               <w:t>-</w:t>
             </w:r>
           </w:p>
@@ -7288,13 +7105,7 @@
             <w:vAlign w:val="center"/>
           </w:tcPr>
           <w:p>
-            <w:pPr>
-              <w:jc w:val="center"/>
-            </w:pPr>
-            <w:r>
-              <w:rPr>
-                <w:sz w:val="20"/>
-              </w:rPr>
+            <w:r>
               <w:t>-</w:t>
             </w:r>
           </w:p>
@@ -7311,13 +7122,7 @@
             <w:vAlign w:val="center"/>
           </w:tcPr>
           <w:p>
-            <w:pPr>
-              <w:jc w:val="center"/>
-            </w:pPr>
-            <w:r>
-              <w:rPr>
-                <w:sz w:val="20"/>
-              </w:rPr>
+            <w:r>
               <w:t>VIX-High intersect GARCH-High</w:t>
             </w:r>
           </w:p>
@@ -7328,14 +7133,8 @@
             <w:vAlign w:val="center"/>
           </w:tcPr>
           <w:p>
-            <w:pPr>
-              <w:jc w:val="center"/>
-            </w:pPr>
-            <w:r>
-              <w:rPr>
-                <w:sz w:val="20"/>
-              </w:rPr>
-              <w:t>47</w:t>
+            <w:r>
+              <w:t>2</w:t>
             </w:r>
           </w:p>
         </w:tc>
@@ -7345,14 +7144,8 @@
             <w:vAlign w:val="center"/>
           </w:tcPr>
           <w:p>
-            <w:pPr>
-              <w:jc w:val="center"/>
-            </w:pPr>
-            <w:r>
-              <w:rPr>
-                <w:sz w:val="20"/>
-              </w:rPr>
-              <w:t>87.2%</w:t>
+            <w:r>
+              <w:t>100.0%</w:t>
             </w:r>
           </w:p>
         </w:tc>
@@ -7362,13 +7155,7 @@
             <w:vAlign w:val="center"/>
           </w:tcPr>
           <w:p>
-            <w:pPr>
-              <w:jc w:val="center"/>
-            </w:pPr>
-            <w:r>
-              <w:rPr>
-                <w:sz w:val="20"/>
-              </w:rPr>
+            <w:r>
               <w:t>-</w:t>
             </w:r>
           </w:p>
@@ -7379,13 +7166,7 @@
             <w:vAlign w:val="center"/>
           </w:tcPr>
           <w:p>
-            <w:pPr>
-              <w:jc w:val="center"/>
-            </w:pPr>
-            <w:r>
-              <w:rPr>
-                <w:sz w:val="20"/>
-              </w:rPr>
+            <w:r>
               <w:t>-</w:t>
             </w:r>
           </w:p>
@@ -7396,13 +7177,7 @@
             <w:vAlign w:val="center"/>
           </w:tcPr>
           <w:p>
-            <w:pPr>
-              <w:jc w:val="center"/>
-            </w:pPr>
-            <w:r>
-              <w:rPr>
-                <w:sz w:val="20"/>
-              </w:rPr>
+            <w:r>
               <w:t>-</w:t>
             </w:r>
           </w:p>
@@ -7571,14 +7346,7 @@
             <w:vAlign w:val="center"/>
           </w:tcPr>
           <w:p>
-            <w:pPr>
-              <w:jc w:val="center"/>
-            </w:pPr>
-            <w:r>
-              <w:rPr>
-                <w:b/>
-                <w:sz w:val="20"/>
-              </w:rPr>
+            <w:r>
               <w:t>Check</w:t>
             </w:r>
           </w:p>
@@ -7589,14 +7357,7 @@
             <w:vAlign w:val="center"/>
           </w:tcPr>
           <w:p>
-            <w:pPr>
-              <w:jc w:val="center"/>
-            </w:pPr>
-            <w:r>
-              <w:rPr>
-                <w:b/>
-                <w:sz w:val="20"/>
-              </w:rPr>
+            <w:r>
               <w:t>High-VIX count</w:t>
             </w:r>
           </w:p>
@@ -7607,14 +7368,7 @@
             <w:vAlign w:val="center"/>
           </w:tcPr>
           <w:p>
-            <w:pPr>
-              <w:jc w:val="center"/>
-            </w:pPr>
-            <w:r>
-              <w:rPr>
-                <w:b/>
-                <w:sz w:val="20"/>
-              </w:rPr>
+            <w:r>
               <w:t>High-VIX accuracy</w:t>
             </w:r>
           </w:p>
@@ -7625,14 +7379,7 @@
             <w:vAlign w:val="center"/>
           </w:tcPr>
           <w:p>
-            <w:pPr>
-              <w:jc w:val="center"/>
-            </w:pPr>
-            <w:r>
-              <w:rPr>
-                <w:b/>
-                <w:sz w:val="20"/>
-              </w:rPr>
+            <w:r>
               <w:t>Low-VIX accuracy</w:t>
             </w:r>
           </w:p>
@@ -7643,14 +7390,7 @@
             <w:vAlign w:val="center"/>
           </w:tcPr>
           <w:p>
-            <w:pPr>
-              <w:jc w:val="center"/>
-            </w:pPr>
-            <w:r>
-              <w:rPr>
-                <w:b/>
-                <w:sz w:val="20"/>
-              </w:rPr>
+            <w:r>
               <w:t>Interpretation</w:t>
             </w:r>
           </w:p>
@@ -7667,14 +7407,8 @@
             <w:vAlign w:val="center"/>
           </w:tcPr>
           <w:p>
-            <w:pPr>
-              <w:jc w:val="center"/>
-            </w:pPr>
-            <w:r>
-              <w:rPr>
-                <w:sz w:val="20"/>
-              </w:rPr>
-              <w:t>Threshold p60-p65</w:t>
+            <w:r>
+              <w:t>Threshold p60 (fixed pre-test = 16.22)</w:t>
             </w:r>
           </w:p>
         </w:tc>
@@ -7684,14 +7418,8 @@
             <w:vAlign w:val="center"/>
           </w:tcPr>
           <w:p>
-            <w:pPr>
-              <w:jc w:val="center"/>
-            </w:pPr>
-            <w:r>
-              <w:rPr>
-                <w:sz w:val="20"/>
-              </w:rPr>
-              <w:t>111-97</w:t>
+            <w:r>
+              <w:t>31</w:t>
             </w:r>
           </w:p>
         </w:tc>
@@ -7701,14 +7429,8 @@
             <w:vAlign w:val="center"/>
           </w:tcPr>
           <w:p>
-            <w:pPr>
-              <w:jc w:val="center"/>
-            </w:pPr>
-            <w:r>
-              <w:rPr>
-                <w:sz w:val="20"/>
-              </w:rPr>
-              <w:t>70.1%-70.3%</w:t>
+            <w:r>
+              <w:t>96.8%</w:t>
             </w:r>
           </w:p>
         </w:tc>
@@ -7718,14 +7440,8 @@
             <w:vAlign w:val="center"/>
           </w:tcPr>
           <w:p>
-            <w:pPr>
-              <w:jc w:val="center"/>
-            </w:pPr>
-            <w:r>
-              <w:rPr>
-                <w:sz w:val="20"/>
-              </w:rPr>
-              <w:t>54%-55%</w:t>
+            <w:r>
+              <w:t>63.6%</w:t>
             </w:r>
           </w:p>
         </w:tc>
@@ -7735,14 +7451,8 @@
             <w:vAlign w:val="center"/>
           </w:tcPr>
           <w:p>
-            <w:pPr>
-              <w:jc w:val="left"/>
-            </w:pPr>
-            <w:r>
-              <w:rPr>
-                <w:sz w:val="20"/>
-              </w:rPr>
-              <w:t>Positive and significant regime advantage</w:t>
+            <w:r>
+              <w:t>Fisher p=1.000 (non-overlap); not significant, underpowered</w:t>
             </w:r>
           </w:p>
         </w:tc>
@@ -7758,14 +7468,8 @@
             <w:vAlign w:val="center"/>
           </w:tcPr>
           <w:p>
-            <w:pPr>
-              <w:jc w:val="center"/>
-            </w:pPr>
-            <w:r>
-              <w:rPr>
-                <w:sz w:val="20"/>
-              </w:rPr>
-              <w:t>Threshold p70</w:t>
+            <w:r>
+              <w:t>Threshold p65 (fixed pre-test = 16.85)</w:t>
             </w:r>
           </w:p>
         </w:tc>
@@ -7775,14 +7479,8 @@
             <w:vAlign w:val="center"/>
           </w:tcPr>
           <w:p>
-            <w:pPr>
-              <w:jc w:val="center"/>
-            </w:pPr>
-            <w:r>
-              <w:rPr>
-                <w:sz w:val="20"/>
-              </w:rPr>
-              <w:t>84</w:t>
+            <w:r>
+              <w:t>27</w:t>
             </w:r>
           </w:p>
         </w:tc>
@@ -7792,14 +7490,8 @@
             <w:vAlign w:val="center"/>
           </w:tcPr>
           <w:p>
-            <w:pPr>
-              <w:jc w:val="center"/>
-            </w:pPr>
-            <w:r>
-              <w:rPr>
-                <w:sz w:val="20"/>
-              </w:rPr>
-              <w:t>72.9%</w:t>
+            <w:r>
+              <w:t>96.3%</w:t>
             </w:r>
           </w:p>
         </w:tc>
@@ -7809,14 +7501,8 @@
             <w:vAlign w:val="center"/>
           </w:tcPr>
           <w:p>
-            <w:pPr>
-              <w:jc w:val="center"/>
-            </w:pPr>
-            <w:r>
-              <w:rPr>
-                <w:sz w:val="20"/>
-              </w:rPr>
-              <w:t>53%-55%</w:t>
+            <w:r>
+              <w:t>64.2%</w:t>
             </w:r>
           </w:p>
         </w:tc>
@@ -7826,14 +7512,8 @@
             <w:vAlign w:val="center"/>
           </w:tcPr>
           <w:p>
-            <w:pPr>
-              <w:jc w:val="left"/>
-            </w:pPr>
-            <w:r>
-              <w:rPr>
-                <w:sz w:val="20"/>
-              </w:rPr>
-              <w:t>Positive and significant regime advantage</w:t>
+            <w:r>
+              <w:t>Fisher p=1.000 (non-overlap); not significant, underpowered</w:t>
             </w:r>
           </w:p>
         </w:tc>
@@ -7849,14 +7529,8 @@
             <w:vAlign w:val="center"/>
           </w:tcPr>
           <w:p>
-            <w:pPr>
-              <w:jc w:val="center"/>
-            </w:pPr>
-            <w:r>
-              <w:rPr>
-                <w:sz w:val="20"/>
-              </w:rPr>
-              <w:t>Threshold p75 (fixed pre-test = 18.71)</w:t>
+            <w:r>
+              <w:t>Threshold p70 (fixed pre-test = 17.77)</w:t>
             </w:r>
           </w:p>
         </w:tc>
@@ -7866,14 +7540,8 @@
             <w:vAlign w:val="center"/>
           </w:tcPr>
           <w:p>
-            <w:pPr>
-              <w:jc w:val="center"/>
-            </w:pPr>
-            <w:r>
-              <w:rPr>
-                <w:sz w:val="20"/>
-              </w:rPr>
-              <w:t>8</w:t>
+            <w:r>
+              <w:t>16</w:t>
             </w:r>
           </w:p>
         </w:tc>
@@ -7883,13 +7551,7 @@
             <w:vAlign w:val="center"/>
           </w:tcPr>
           <w:p>
-            <w:pPr>
-              <w:jc w:val="center"/>
-            </w:pPr>
-            <w:r>
-              <w:rPr>
-                <w:sz w:val="20"/>
-              </w:rPr>
+            <w:r>
               <w:t>100.0%</w:t>
             </w:r>
           </w:p>
@@ -7900,14 +7562,8 @@
             <w:vAlign w:val="center"/>
           </w:tcPr>
           <w:p>
-            <w:pPr>
-              <w:jc w:val="center"/>
-            </w:pPr>
-            <w:r>
-              <w:rPr>
-                <w:sz w:val="20"/>
-              </w:rPr>
-              <w:t>66.5%</w:t>
+            <w:r>
+              <w:t>65.4%</w:t>
             </w:r>
           </w:p>
         </w:tc>
@@ -7917,14 +7573,8 @@
             <w:vAlign w:val="center"/>
           </w:tcPr>
           <w:p>
-            <w:pPr>
-              <w:jc w:val="left"/>
-            </w:pPr>
-            <w:r>
-              <w:rPr>
-                <w:sz w:val="20"/>
-              </w:rPr>
-              <w:t>Main result under corrected protocol; sparse High-VIX (n=8)</w:t>
+            <w:r>
+              <w:t>Too sparse for non-overlap Fisher test</w:t>
             </w:r>
           </w:p>
         </w:tc>
@@ -7940,14 +7590,8 @@
             <w:vAlign w:val="center"/>
           </w:tcPr>
           <w:p>
-            <w:pPr>
-              <w:jc w:val="center"/>
-            </w:pPr>
-            <w:r>
-              <w:rPr>
-                <w:sz w:val="20"/>
-              </w:rPr>
-              <w:t>Threshold p85</w:t>
+            <w:r>
+              <w:t>Threshold p75 (fixed pre-test = 18.71)</w:t>
             </w:r>
           </w:p>
         </w:tc>
@@ -7957,14 +7601,8 @@
             <w:vAlign w:val="center"/>
           </w:tcPr>
           <w:p>
-            <w:pPr>
-              <w:jc w:val="center"/>
-            </w:pPr>
-            <w:r>
-              <w:rPr>
-                <w:sz w:val="20"/>
-              </w:rPr>
-              <w:t>28</w:t>
+            <w:r>
+              <w:t>8</w:t>
             </w:r>
           </w:p>
         </w:tc>
@@ -7974,14 +7612,8 @@
             <w:vAlign w:val="center"/>
           </w:tcPr>
           <w:p>
-            <w:pPr>
-              <w:jc w:val="center"/>
-            </w:pPr>
-            <w:r>
-              <w:rPr>
-                <w:sz w:val="20"/>
-              </w:rPr>
-              <w:t>92.9%</w:t>
+            <w:r>
+              <w:t>100.0%</w:t>
             </w:r>
           </w:p>
         </w:tc>
@@ -7991,14 +7623,8 @@
             <w:vAlign w:val="center"/>
           </w:tcPr>
           <w:p>
-            <w:pPr>
-              <w:jc w:val="center"/>
-            </w:pPr>
-            <w:r>
-              <w:rPr>
-                <w:sz w:val="20"/>
-              </w:rPr>
-              <w:t>55.2%</w:t>
+            <w:r>
+              <w:t>66.5%</w:t>
             </w:r>
           </w:p>
         </w:tc>
@@ -8008,14 +7634,8 @@
             <w:vAlign w:val="center"/>
           </w:tcPr>
           <w:p>
-            <w:pPr>
-              <w:jc w:val="left"/>
-            </w:pPr>
-            <w:r>
-              <w:rPr>
-                <w:sz w:val="20"/>
-              </w:rPr>
-              <w:t>Signal concentrates further in extreme stress</w:t>
+            <w:r>
+              <w:t>Main result under corrected protocol; sparse High-VIX (n=8)</w:t>
             </w:r>
           </w:p>
         </w:tc>
@@ -8031,15 +7651,8 @@
             <w:vAlign w:val="center"/>
           </w:tcPr>
           <w:p>
-            <w:pPr>
-              <w:jc w:val="center"/>
-            </w:pPr>
-            <w:r>
-              <w:rPr>
-                <w:sz w:val="20"/>
-              </w:rPr>
-              <w:lastRenderedPageBreak/>
-              <w:t>2025-Q1</w:t>
+            <w:r>
+              <w:t>Threshold p85 (fixed pre-test = 21.00)</w:t>
             </w:r>
           </w:p>
         </w:tc>
@@ -8049,14 +7662,8 @@
             <w:vAlign w:val="center"/>
           </w:tcPr>
           <w:p>
-            <w:pPr>
-              <w:jc w:val="center"/>
-            </w:pPr>
-            <w:r>
-              <w:rPr>
-                <w:sz w:val="20"/>
-              </w:rPr>
-              <w:t>17</w:t>
+            <w:r>
+              <w:t>4</w:t>
             </w:r>
           </w:p>
         </w:tc>
@@ -8066,14 +7673,8 @@
             <w:vAlign w:val="center"/>
           </w:tcPr>
           <w:p>
-            <w:pPr>
-              <w:jc w:val="center"/>
-            </w:pPr>
-            <w:r>
-              <w:rPr>
-                <w:sz w:val="20"/>
-              </w:rPr>
-              <w:t>64.7%</w:t>
+            <w:r>
+              <w:t>100.0%</w:t>
             </w:r>
           </w:p>
         </w:tc>
@@ -8083,14 +7684,8 @@
             <w:vAlign w:val="center"/>
           </w:tcPr>
           <w:p>
-            <w:pPr>
-              <w:jc w:val="center"/>
-            </w:pPr>
-            <w:r>
-              <w:rPr>
-                <w:sz w:val="20"/>
-              </w:rPr>
-              <w:t>37.1%</w:t>
+            <w:r>
+              <w:t>67.1%</w:t>
             </w:r>
           </w:p>
         </w:tc>
@@ -8100,14 +7695,8 @@
             <w:vAlign w:val="center"/>
           </w:tcPr>
           <w:p>
-            <w:pPr>
-              <w:jc w:val="left"/>
-            </w:pPr>
-            <w:r>
-              <w:rPr>
-                <w:sz w:val="20"/>
-              </w:rPr>
-              <w:t>Initial stress-state advantage appears</w:t>
+            <w:r>
+              <w:t>Count correctly &lt;= p75 count; too sparse for inference</w:t>
             </w:r>
           </w:p>
         </w:tc>
@@ -8123,14 +7712,8 @@
             <w:vAlign w:val="center"/>
           </w:tcPr>
           <w:p>
-            <w:pPr>
-              <w:jc w:val="center"/>
-            </w:pPr>
-            <w:r>
-              <w:rPr>
-                <w:sz w:val="20"/>
-              </w:rPr>
-              <w:t>2025-Q2</w:t>
+            <w:r>
+              <w:t>2025-Q2 (fixed p75 threshold)</w:t>
             </w:r>
           </w:p>
         </w:tc>
@@ -8140,14 +7723,8 @@
             <w:vAlign w:val="center"/>
           </w:tcPr>
           <w:p>
-            <w:pPr>
-              <w:jc w:val="center"/>
-            </w:pPr>
-            <w:r>
-              <w:rPr>
-                <w:sz w:val="20"/>
-              </w:rPr>
-              <w:t>41</w:t>
+            <w:r>
+              <w:t>8</w:t>
             </w:r>
           </w:p>
         </w:tc>
@@ -8157,14 +7734,8 @@
             <w:vAlign w:val="center"/>
           </w:tcPr>
           <w:p>
-            <w:pPr>
-              <w:jc w:val="center"/>
-            </w:pPr>
-            <w:r>
-              <w:rPr>
-                <w:sz w:val="20"/>
-              </w:rPr>
-              <w:t>92.7%</w:t>
+            <w:r>
+              <w:t>100.0%</w:t>
             </w:r>
           </w:p>
         </w:tc>
@@ -8174,14 +7745,8 @@
             <w:vAlign w:val="center"/>
           </w:tcPr>
           <w:p>
-            <w:pPr>
-              <w:jc w:val="center"/>
-            </w:pPr>
-            <w:r>
-              <w:rPr>
-                <w:sz w:val="20"/>
-              </w:rPr>
-              <w:t>58.3%</w:t>
+            <w:r>
+              <w:t>88.7%</w:t>
             </w:r>
           </w:p>
         </w:tc>
@@ -8191,105 +7756,8 @@
             <w:vAlign w:val="center"/>
           </w:tcPr>
           <w:p>
-            <w:pPr>
-              <w:jc w:val="left"/>
-            </w:pPr>
-            <w:r>
-              <w:rPr>
-                <w:sz w:val="20"/>
-              </w:rPr>
-              <w:t>Signal remains stronger in elevated-volatility state</w:t>
-            </w:r>
-          </w:p>
-        </w:tc>
-      </w:tr>
-      <w:tr>
-        <w:trPr>
-          <w:trHeight w:val="532"/>
-          <w:jc w:val="center"/>
-        </w:trPr>
-        <w:tc>
-          <w:tcPr>
-            <w:tcW w:w="2374" w:type="dxa"/>
-            <w:vAlign w:val="center"/>
-          </w:tcPr>
-          <w:p>
-            <w:pPr>
-              <w:jc w:val="center"/>
-            </w:pPr>
-            <w:r>
-              <w:rPr>
-                <w:sz w:val="20"/>
-              </w:rPr>
-              <w:t>P1 replication</w:t>
-            </w:r>
-          </w:p>
-        </w:tc>
-        <w:tc>
-          <w:tcPr>
-            <w:tcW w:w="1213" w:type="dxa"/>
-            <w:vAlign w:val="center"/>
-          </w:tcPr>
-          <w:p>
-            <w:pPr>
-              <w:jc w:val="center"/>
-            </w:pPr>
-            <w:r>
-              <w:rPr>
-                <w:sz w:val="20"/>
-              </w:rPr>
-              <w:t>23</w:t>
-            </w:r>
-          </w:p>
-        </w:tc>
-        <w:tc>
-          <w:tcPr>
-            <w:tcW w:w="1624" w:type="dxa"/>
-            <w:vAlign w:val="center"/>
-          </w:tcPr>
-          <w:p>
-            <w:pPr>
-              <w:jc w:val="center"/>
-            </w:pPr>
-            <w:r>
-              <w:rPr>
-                <w:sz w:val="20"/>
-              </w:rPr>
-              <w:t>65.2%</w:t>
-            </w:r>
-          </w:p>
-        </w:tc>
-        <w:tc>
-          <w:tcPr>
-            <w:tcW w:w="1501" w:type="dxa"/>
-            <w:vAlign w:val="center"/>
-          </w:tcPr>
-          <w:p>
-            <w:pPr>
-              <w:jc w:val="center"/>
-            </w:pPr>
-            <w:r>
-              <w:rPr>
-                <w:sz w:val="20"/>
-              </w:rPr>
-              <w:t>35.9%</w:t>
-            </w:r>
-          </w:p>
-        </w:tc>
-        <w:tc>
-          <w:tcPr>
-            <w:tcW w:w="2922" w:type="dxa"/>
-            <w:vAlign w:val="center"/>
-          </w:tcPr>
-          <w:p>
-            <w:pPr>
-              <w:jc w:val="left"/>
-            </w:pPr>
-            <w:r>
-              <w:rPr>
-                <w:sz w:val="20"/>
-              </w:rPr>
-              <w:t>Independent training window reproduces direction and scale</w:t>
+            <w:r>
+              <w:t>All 8 High-VIX test days fall in a single quarter</w:t>
             </w:r>
           </w:p>
         </w:tc>

</xml_diff>

<commit_message>
Regenerate and re-embed Figures 3-9 with corrected, leakage-safe pipeline results
</commit_message>
<xml_diff>
--- a/Manuscript/Major_Revision_02_/Manuscript_26082026.docx
+++ b/Manuscript/Major_Revision_02_/Manuscript_26082026.docx
@@ -4795,7 +4795,7 @@
         </w:rPr>
         <w:drawing>
           <wp:inline distT="0" distB="0" distL="0" distR="0" wp14:anchorId="5F0D4459" wp14:editId="1B03E7B2">
-            <wp:extent cx="5303520" cy="1877375"/>
+            <wp:extent cx="5303520" cy="2572955"/>
             <wp:effectExtent l="0" t="0" r="0" b="0"/>
             <wp:docPr id="3" name="Picture 3"/>
             <wp:cNvGraphicFramePr>
@@ -4817,7 +4817,7 @@
                   <pic:spPr>
                     <a:xfrm>
                       <a:off x="0" y="0"/>
-                      <a:ext cx="5303520" cy="1877375"/>
+                      <a:ext cx="5303520" cy="2572955"/>
                     </a:xfrm>
                     <a:prstGeom prst="rect">
                       <a:avLst/>
@@ -4882,7 +4882,7 @@
         </w:rPr>
         <w:drawing>
           <wp:inline distT="0" distB="0" distL="0" distR="0" wp14:anchorId="7FDC5793" wp14:editId="4318A048">
-            <wp:extent cx="5303520" cy="1330390"/>
+            <wp:extent cx="5303520" cy="2970382"/>
             <wp:effectExtent l="0" t="0" r="0" b="0"/>
             <wp:docPr id="4" name="Picture 4"/>
             <wp:cNvGraphicFramePr>
@@ -4904,7 +4904,7 @@
                   <pic:spPr>
                     <a:xfrm>
                       <a:off x="0" y="0"/>
-                      <a:ext cx="5303520" cy="1330390"/>
+                      <a:ext cx="5303520" cy="2970382"/>
                     </a:xfrm>
                     <a:prstGeom prst="rect">
                       <a:avLst/>
@@ -5575,7 +5575,7 @@
         <w:lastRenderedPageBreak/>
         <w:drawing>
           <wp:inline distT="0" distB="0" distL="0" distR="0" wp14:anchorId="22C9C9FE" wp14:editId="3256D4F7">
-            <wp:extent cx="5303520" cy="3966498"/>
+            <wp:extent cx="5303520" cy="3335404"/>
             <wp:effectExtent l="0" t="0" r="0" b="0"/>
             <wp:docPr id="5" name="Picture 5"/>
             <wp:cNvGraphicFramePr>
@@ -5597,7 +5597,7 @@
                   <pic:spPr>
                     <a:xfrm>
                       <a:off x="0" y="0"/>
-                      <a:ext cx="5303520" cy="3966498"/>
+                      <a:ext cx="5303520" cy="3335404"/>
                     </a:xfrm>
                     <a:prstGeom prst="rect">
                       <a:avLst/>
@@ -5638,7 +5638,7 @@
         </w:rPr>
         <w:drawing>
           <wp:inline distT="0" distB="0" distL="0" distR="0" wp14:anchorId="4834CA57" wp14:editId="2C4357CE">
-            <wp:extent cx="5303520" cy="1738128"/>
+            <wp:extent cx="5303520" cy="1885768"/>
             <wp:effectExtent l="0" t="0" r="0" b="0"/>
             <wp:docPr id="6" name="Picture 6"/>
             <wp:cNvGraphicFramePr>
@@ -5660,7 +5660,7 @@
                   <pic:spPr>
                     <a:xfrm>
                       <a:off x="0" y="0"/>
-                      <a:ext cx="5303520" cy="1738128"/>
+                      <a:ext cx="5303520" cy="1885768"/>
                     </a:xfrm>
                     <a:prstGeom prst="rect">
                       <a:avLst/>
@@ -6623,7 +6623,7 @@
         <w:lastRenderedPageBreak/>
         <w:drawing>
           <wp:inline distT="0" distB="0" distL="0" distR="0" wp14:anchorId="2E8C3867" wp14:editId="545C9498">
-            <wp:extent cx="5303520" cy="1630798"/>
+            <wp:extent cx="5303520" cy="1727211"/>
             <wp:effectExtent l="0" t="0" r="0" b="0"/>
             <wp:docPr id="7" name="Picture 7"/>
             <wp:cNvGraphicFramePr>
@@ -6645,7 +6645,7 @@
                   <pic:spPr>
                     <a:xfrm>
                       <a:off x="0" y="0"/>
-                      <a:ext cx="5303520" cy="1630798"/>
+                      <a:ext cx="5303520" cy="1727211"/>
                     </a:xfrm>
                     <a:prstGeom prst="rect">
                       <a:avLst/>
@@ -7211,7 +7211,7 @@
         <w:lastRenderedPageBreak/>
         <w:drawing>
           <wp:inline distT="0" distB="0" distL="0" distR="0" wp14:anchorId="7EBD6880" wp14:editId="435EFC2C">
-            <wp:extent cx="5303520" cy="2140870"/>
+            <wp:extent cx="5303520" cy="3326021"/>
             <wp:effectExtent l="0" t="0" r="0" b="0"/>
             <wp:docPr id="8" name="Picture 8"/>
             <wp:cNvGraphicFramePr>
@@ -7233,7 +7233,7 @@
                   <pic:spPr>
                     <a:xfrm>
                       <a:off x="0" y="0"/>
-                      <a:ext cx="5303520" cy="2140870"/>
+                      <a:ext cx="5303520" cy="3326021"/>
                     </a:xfrm>
                     <a:prstGeom prst="rect">
                       <a:avLst/>
@@ -7784,7 +7784,7 @@
         </w:rPr>
         <w:drawing>
           <wp:inline distT="0" distB="0" distL="0" distR="0" wp14:anchorId="2DFCFFA0" wp14:editId="5DE75638">
-            <wp:extent cx="5303520" cy="2018688"/>
+            <wp:extent cx="5303520" cy="1726243"/>
             <wp:effectExtent l="0" t="0" r="0" b="0"/>
             <wp:docPr id="9" name="Picture 9"/>
             <wp:cNvGraphicFramePr>
@@ -7806,7 +7806,7 @@
                   <pic:spPr>
                     <a:xfrm>
                       <a:off x="0" y="0"/>
-                      <a:ext cx="5303520" cy="2018688"/>
+                      <a:ext cx="5303520" cy="1726243"/>
                     </a:xfrm>
                     <a:prstGeom prst="rect">
                       <a:avLst/>

</xml_diff>

<commit_message>
Sweep prose: fix 8 stale/contradictory passages, drop unreliable P1 cross-pipeline figure, correct Table 1 wording, add Sharpe RFR convention
</commit_message>
<xml_diff>
--- a/Manuscript/Major_Revision_02_/Manuscript_26082026.docx
+++ b/Manuscript/Major_Revision_02_/Manuscript_26082026.docx
@@ -170,12 +170,9 @@
         <w:ind w:firstLine="360"/>
       </w:pPr>
       <w:r>
-        <w:t xml:space="preserve">The present study asks a narrow but decision-relevant question: does India VIX condition the directional predictability of Bank Nifty at short and medium horizons when the underlying predictive engine is a modern stacking ensemble? The answer is yes, but only at the 21-trading-day horizon. The ensemble does not dominate naive baselines unconditionally; in fact, the unconditioned 21-day test accuracy is below the majority-class rate in a strongly bullish test sample. Once the held-out test period is partitioned by contemporaneous India VIX, however, the </w:t>
-      </w:r>
-      <w:r>
-        <w:lastRenderedPageBreak/>
-        <w:t>signal concentrates sharply in the upper-volatility regime. This is exactly the kind of pattern that a decision-support system should surface to the end user: not permanent confidence, but state-dependent confidence.</w:t>
-      </w:r>
+        <w:t>The present study asks a narrow but decision-relevant question: does India VIX condition the directional predictability of Bank Nifty at short and medium horizons when the underlying predictive engine is a modern stacking ensemble? The answer, after correcting for split leakage, threshold look-ahead bias, and overlapping-observation dependence, is: not reliably, at least not in this sample. The ensemble does not dominate naive baselines unconditionally; the unconditioned 21-day test accuracy is below the majority-class rate in a strongly bullish test sample. Partitioning the held-out test period by a pre-test-fixed India VIX threshold does surface a large accuracy gap at the 21-day horizon (100.0% vs 66.5%), but the High-VIX subset contains only eight observations, all realizing the same outcome, and dependence-aware significance tests (non-overlapping Fisher, block-permutation) do not reject the null after correction. We therefore present this as a conditional pattern warranting cautious interpretation and further replication, not as an established regime effect.</w:t>
+      </w:r>
+      <w:r/>
     </w:p>
     <w:p>
       <w:pPr>
@@ -183,11 +180,9 @@
         <w:ind w:firstLine="360"/>
       </w:pPr>
       <w:r>
-        <w:t>This paper makes four contributions. First, it provides the first evidence in this project context that Bank Nifty directional forecasting accuracy is materially regime-dependent when regimes are defined by India VIX and evaluated on a fully held-out period. Second, it shows that the effect is horizon-specific: no comparable advantage appears at 1-day or 5-day horizons, which argues against a generic high-volatility uplift story. Third, it converts the statistical result into a deployment rule and shows that selective participation improves risk-adjusted performance relative to buy-and-hold while using market exposure on only 48 out of 277 test days. Fourth, it frames the ensemble plus regime filter as an expert decision system rather than as a raw black-box classifier</w:t>
-      </w:r>
-      <w:r>
-        <w:t>.</w:t>
-      </w:r>
+        <w:t>This paper makes four contributions. First, it provides the first evidence in this project context that Bank Nifty directional forecasting accuracy shows a large, but statistically unconfirmed, regime-conditional gap when regimes are defined by a pre-test-fixed India VIX threshold and evaluated on a fully held-out period. Second, it shows that the effect is horizon-specific: no comparable gap appears at 1-day or 5-day horizons, which argues against a generic high-volatility uplift story. Third, it converts the statistical result into an explicit, deployable trading rule and reports its risk-adjusted performance honestly: under the corrected protocol the selective rule trades once, is active for 21 of 256 aligned test days, lowers maximum drawdown relative to buy-and-hold (-3.69% vs -6.62%) but does not exceed buy-and-hold Sharpe at any tested transaction-cost level. Fourth, it frames the ensemble plus regime filter as an expert decision system and documents, transparently, the methodological corrections (leakage removal, look-ahead-bias removal, dependence-aware inference) needed before such a system's claims can be trusted.</w:t>
+      </w:r>
+      <w:r/>
     </w:p>
     <w:p>
       <w:pPr>
@@ -997,14 +992,8 @@
             <w:vAlign w:val="center"/>
           </w:tcPr>
           <w:p>
-            <w:pPr>
-              <w:jc w:val="left"/>
-            </w:pPr>
-            <w:r>
-              <w:rPr>
-                <w:sz w:val="20"/>
-              </w:rPr>
-              <w:t>Partition held-out test predictions into High-VIX and Low-VIX regimes using contemporaneous India VIX</w:t>
+            <w:r>
+              <w:t>Partition held-out test predictions into High-VIX and Low-VIX regimes using a pre-test-fixed India VIX threshold (not the test-period distribution)</w:t>
             </w:r>
           </w:p>
         </w:tc>
@@ -3107,14 +3096,10 @@
         <w:ind w:firstLine="360"/>
       </w:pPr>
       <w:r>
-        <w:t xml:space="preserve">The use of a contemporaneous test-period threshold needs precise interpretation. It is not part of model training, hyperparameter search, or signal construction; it is a diagnostic partition applied after the model has already emitted predictions on the held-out sample. The question being asked is therefore descriptive but decision-relevant: on which held-out states </w:t>
-      </w:r>
-      <w:r>
-        <w:t>do</w:t>
-      </w:r>
-      <w:r>
-        <w:t xml:space="preserve"> the already-trained model appear materially more reliable? This is a valid question for an expert system because deployment filters are often calibrated on live-state diagnostics even when the underlying predictor itself remains frozen.</w:t>
-      </w:r>
+        <w:t>The pre-test-fixed threshold used here differs from a diagnostic partition computed after observing the test period: it is calibrated only from information available before the test window begins (train+validation p75 = 18.71), so it could in principle be applied in real time without access to future data. This is what makes the regime filter deployable rather than merely descriptive. The trade-off is that a pre-test-fixed threshold is not guaranteed to match the test period's own volatility distribution, which is why the resulting High-VIX subset is sparse (n = 8) here and why we report sensitivity to alternative calibration windows (Section 6.3) rather than treating this single threshold choice as definitive.</w:t>
+      </w:r>
+      <w:r/>
+      <w:r/>
     </w:p>
     <w:p>
       <w:pPr>
@@ -4064,7 +4049,7 @@
         <w:ind w:firstLine="360"/>
       </w:pPr>
       <w:r>
-        <w:t>From a systems perspective, the regime-conditioned result implies a practical deployment policy. If the model is used continuously, its decision quality is mediocre. If it is used only when India VIX lies in the upper quartile of the current environment, its decision quality becomes substantially stronger. The regime variable therefore acts as a trust filter layered on top of the forecasting engine. This is the core expert-system contribution of the paper.</w:t>
+        <w:t>From a systems perspective, the regime-conditioned result illustrates the kind of trust filter a deployment policy could use: if the model is used continuously, its decision quality is mediocre; if it is used only when India VIX lies in the upper quartile of the pre-test environment, the observed decision quality in this sample is much higher. However, with only eight High-VIX observations and no statistically significant Fisher or permutation result, this pattern should be read as a proof-of-concept for the trust-filter architecture rather than as a validated expert-system contribution. Establishing the latter would require the effect to replicate across additional high-volatility episodes (Section 6.4).</w:t>
       </w:r>
     </w:p>
     <w:p>
@@ -4950,12 +4935,9 @@
         <w:ind w:firstLine="360"/>
       </w:pPr>
       <w:r>
-        <w:t xml:space="preserve">The statistical result is translated into a conservative deployment test. Under the corrected implementation (signal at day t close, entry at open[t+1], exit at close[t+21], no overlapping positions), the selective High-VIX plus Up strategy is active for only one 21-day trade in the </w:t>
-      </w:r>
-      <w:r>
-        <w:lastRenderedPageBreak/>
-        <w:t>evaluated window. At zero cost, strategy Sharpe is 0.455 versus 1.204 for buy-and-hold, while maximum drawdown is lower (-3.69% versus -6.62%). Thus, drawdown control improves, but Sharpe does not exceed buy-and-hold in this corrected run.</w:t>
-      </w:r>
+        <w:t>The statistical result is translated into a conservative deployment test. Sharpe ratios throughout this paper use an annual risk-free rate of 6.5% (India 91-day T-bill, RBI FY2025 average; daily RFR = 6.5%/252), with both the strategy and buy-and-hold series annualized as (mean daily excess return / std daily excess return) x sqrt(252) over the same 256-day evaluation window. Under the corrected implementation (signal at day t close, entry at open[t+1], exit at close[t+21], no overlapping positions), the selective High-VIX plus Up strategy is active for only one 21-day trade in the evaluated window. At zero cost, strategy Sharpe is 0.455 versus 1.204 for buy-and-hold, while maximum drawdown is lower (-3.69% versus -6.62%). Thus, drawdown control improves, but Sharpe does not exceed buy-and-hold in this corrected run.</w:t>
+      </w:r>
+      <w:r/>
     </w:p>
     <w:p>
       <w:pPr>
@@ -6705,20 +6687,12 @@
         <w:ind w:firstLine="360"/>
       </w:pPr>
       <w:r>
-        <w:t>The interpretation is economically coherent. Historical-volatility models summarize what the market has already experienced, whereas India VIX incorporates forward-looking uncertainty and risk sentiment inferred from options prices. For a decision-support system, that distinction is crucial: the more useful state variable is the one that better anticipates when the directional signal becomes reliable. The data indicate that India VIX is the stronger gatekeeper.</w:t>
-      </w:r>
-      <w:r>
-        <w:t xml:space="preserve"> </w:t>
-      </w:r>
-      <w:r>
-        <w:t>Table 10</w:t>
-      </w:r>
-      <w:r>
-        <w:t xml:space="preserve"> highlights </w:t>
-      </w:r>
-      <w:r>
-        <w:t>India VIX regime versus GARCH(1,1) regime at the 21-day horizon.</w:t>
-      </w:r>
+        <w:t>The interpretation is more tentative than in the previous draft. Historical-volatility models summarize what the market has already experienced, whereas India VIX incorporates forward-looking uncertainty inferred from options prices; conceptually India VIX remains the more natural gating variable for this reason. Empirically, however, under the corrected pre-test protocol the GARCH(1,1) regime split (n = 10 High-GARCH, 80.0% accuracy) is no more statistically supported than the VIX split (n = 8, 100.0% accuracy): both non-overlapping Fisher tests return p = 1.000. We therefore cannot claim India VIX is empirically the stronger gatekeeper in this sample; the comparison is inconclusive given how few High-regime observations either variable yields under a pre-test-fixed threshold. Table 10 reports both regime splits and their intersection.</w:t>
+      </w:r>
+      <w:r/>
+      <w:r/>
+      <w:r/>
+      <w:r/>
     </w:p>
     <w:p>
       <w:pPr>
@@ -7187,17 +7161,11 @@
     <w:p/>
     <w:p>
       <w:r>
-        <w:t xml:space="preserve">The Fig. </w:t>
-      </w:r>
-      <w:r>
-        <w:t>8</w:t>
-      </w:r>
-      <w:r>
-        <w:t>, shows c</w:t>
-      </w:r>
-      <w:r>
-        <w:t>omparison of India VIX and GARCH-based regime filters. India VIX identifies the high-reliability state more effectively than backward-looking conditional volatility.</w:t>
-      </w:r>
+        <w:t>Fig. 8 compares the India VIX and GARCH-based regime filters under the corrected pre-test protocol. Neither split reaches statistical significance (Fisher p = 1.000 for both), so the figure should be read as descriptive rather than as evidence that one filter dominates the other.</w:t>
+      </w:r>
+      <w:r/>
+      <w:r/>
+      <w:r/>
     </w:p>
     <w:p>
       <w:pPr>
@@ -7862,7 +7830,7 @@
         <w:ind w:firstLine="360"/>
       </w:pPr>
       <w:r>
-        <w:t>The replication also clarifies what the paper should and should not claim. It should claim that the conditional pattern appears stable enough to emerge across two independently trained pipelines. It should not claim that the absolute accuracy level is identical across every setup. In a forecasting context, sign consistency in the regime effect combined with similar economic magnitude is stronger evidence than demanding identical scores in structurally different samples.</w:t>
+        <w:t>On inspection, the available secondary pipeline (P1) does not provide a clean independent replication: its regime threshold was calibrated from the test-period VIX distribution rather than a pre-test window -- the same look-ahead-bias pattern this revision corrects for the primary pipeline -- and different snapshots of its regime split in the underlying project are mutually inconsistent in both sample window and High-VIX count. We therefore do not report a cross-pipeline replication result in this revision. A properly leakage-safe replication -- an independently trained pipeline with its own pre-test-fixed threshold -- is left as a concrete next step (Section 7).</w:t>
       </w:r>
     </w:p>
     <w:p>
@@ -7873,53 +7841,6 @@
     </w:p>
     <w:p>
       <w:pPr>
-        <w:spacing w:before="120" w:after="40"/>
-        <w:jc w:val="center"/>
-      </w:pPr>
-      <w:r>
-        <w:rPr>
-          <w:noProof/>
-        </w:rPr>
-        <w:lastRenderedPageBreak/>
-        <w:drawing>
-          <wp:inline distT="0" distB="0" distL="0" distR="0" wp14:anchorId="0EE38BEC" wp14:editId="4A7B8D96">
-            <wp:extent cx="5303520" cy="2183802"/>
-            <wp:effectExtent l="0" t="0" r="0" b="0"/>
-            <wp:docPr id="10" name="Picture 10"/>
-            <wp:cNvGraphicFramePr>
-              <a:graphicFrameLocks xmlns:a="http://schemas.openxmlformats.org/drawingml/2006/main" noChangeAspect="1"/>
-            </wp:cNvGraphicFramePr>
-            <a:graphic xmlns:a="http://schemas.openxmlformats.org/drawingml/2006/main">
-              <a:graphicData uri="http://schemas.openxmlformats.org/drawingml/2006/picture">
-                <pic:pic xmlns:pic="http://schemas.openxmlformats.org/drawingml/2006/picture">
-                  <pic:nvPicPr>
-                    <pic:cNvPr id="0" name="NB-P2-07_p1_vs_p2_hvix_equity.png"/>
-                    <pic:cNvPicPr/>
-                  </pic:nvPicPr>
-                  <pic:blipFill>
-                    <a:blip r:embed="rId17"/>
-                    <a:stretch>
-                      <a:fillRect/>
-                    </a:stretch>
-                  </pic:blipFill>
-                  <pic:spPr>
-                    <a:xfrm>
-                      <a:off x="0" y="0"/>
-                      <a:ext cx="5303520" cy="2183802"/>
-                    </a:xfrm>
-                    <a:prstGeom prst="rect">
-                      <a:avLst/>
-                    </a:prstGeom>
-                  </pic:spPr>
-                </pic:pic>
-              </a:graphicData>
-            </a:graphic>
-          </wp:inline>
-        </w:drawing>
-      </w:r>
-    </w:p>
-    <w:p>
-      <w:pPr>
         <w:spacing w:before="80" w:after="80"/>
         <w:jc w:val="center"/>
         <w:rPr>
@@ -7931,7 +7852,7 @@
           <w:iCs/>
           <w:sz w:val="20"/>
         </w:rPr>
-        <w:t>Fig. 10. Cross-pipeline comparison of the High-VIX plus Up strategy.</w:t>
+        <w:t>Cross-pipeline replication figure omitted in this revision: the only available secondary pipeline (P1) uses a look-ahead-biased, test-period-derived regime threshold and is not a valid leakage-safe comparison (see Section 6.4).</w:t>
       </w:r>
     </w:p>
     <w:p/>

</xml_diff>

<commit_message>
Add real hyperparameter values (Table 4) and SHAP results (Section 5.4 + new Fig 11); correct ATR/Bollinger overclaim in Sections 5.4 and 7
</commit_message>
<xml_diff>
--- a/Manuscript/Major_Revision_02_/Manuscript_26082026.docx
+++ b/Manuscript/Major_Revision_02_/Manuscript_26082026.docx
@@ -2477,14 +2477,7 @@
             <w:vAlign w:val="center"/>
           </w:tcPr>
           <w:p>
-            <w:pPr>
-              <w:jc w:val="center"/>
-            </w:pPr>
-            <w:r>
-              <w:rPr>
-                <w:b/>
-                <w:sz w:val="20"/>
-              </w:rPr>
+            <w:r>
               <w:t>Key configuration</w:t>
             </w:r>
           </w:p>
@@ -2552,22 +2545,8 @@
             <w:vAlign w:val="center"/>
           </w:tcPr>
           <w:p>
-            <w:pPr>
-              <w:jc w:val="left"/>
-            </w:pPr>
-            <w:proofErr w:type="spellStart"/>
-            <w:r>
-              <w:rPr>
-                <w:sz w:val="20"/>
-              </w:rPr>
-              <w:t>Optuna</w:t>
-            </w:r>
-            <w:proofErr w:type="spellEnd"/>
-            <w:r>
-              <w:rPr>
-                <w:sz w:val="20"/>
-              </w:rPr>
-              <w:t xml:space="preserve"> tuned; time-series CV</w:t>
+            <w:r>
+              <w:t>n_estimators=176, max_depth=4, lr=0.0116, subsample=0.774, colsample_bytree=0.775, reg_alpha=0.0002, reg_lambda=4.89; Optuna (100 trials), time-series CV</w:t>
             </w:r>
           </w:p>
         </w:tc>
@@ -2634,22 +2613,8 @@
             <w:vAlign w:val="center"/>
           </w:tcPr>
           <w:p>
-            <w:pPr>
-              <w:jc w:val="left"/>
-            </w:pPr>
-            <w:proofErr w:type="spellStart"/>
-            <w:r>
-              <w:rPr>
-                <w:sz w:val="20"/>
-              </w:rPr>
-              <w:t>Optuna</w:t>
-            </w:r>
-            <w:proofErr w:type="spellEnd"/>
-            <w:r>
-              <w:rPr>
-                <w:sz w:val="20"/>
-              </w:rPr>
-              <w:t xml:space="preserve"> tuned; time-series CV</w:t>
+            <w:r>
+              <w:t>n_estimators=130, max_depth=4, lr=0.0100, num_leaves=39, subsample=0.944, colsample_bytree=0.742, reg_alpha=4.04, reg_lambda=5.86; Optuna, time-series CV</w:t>
             </w:r>
           </w:p>
         </w:tc>
@@ -2716,14 +2681,8 @@
             <w:vAlign w:val="center"/>
           </w:tcPr>
           <w:p>
-            <w:pPr>
-              <w:jc w:val="left"/>
-            </w:pPr>
-            <w:r>
-              <w:rPr>
-                <w:sz w:val="20"/>
-              </w:rPr>
-              <w:t>Chronological training with tuned tree depth and count</w:t>
+            <w:r>
+              <w:t>n_estimators=376, max_depth=3, min_samples_split=12, min_samples_leaf=3, max_features=log2; chronological training</w:t>
             </w:r>
           </w:p>
         </w:tc>
@@ -2792,22 +2751,8 @@
             <w:vAlign w:val="center"/>
           </w:tcPr>
           <w:p>
-            <w:pPr>
-              <w:jc w:val="left"/>
-            </w:pPr>
-            <w:proofErr w:type="spellStart"/>
-            <w:r>
-              <w:rPr>
-                <w:sz w:val="20"/>
-              </w:rPr>
-              <w:t>Optuna</w:t>
-            </w:r>
-            <w:proofErr w:type="spellEnd"/>
-            <w:r>
-              <w:rPr>
-                <w:sz w:val="20"/>
-              </w:rPr>
-              <w:t xml:space="preserve"> tuned; probability output</w:t>
+            <w:r>
+              <w:t>iterations=155, depth=8, lr=0.0125, l2_leaf_reg=9.64, bagging_temperature=0.205; Optuna, probability output</w:t>
             </w:r>
           </w:p>
         </w:tc>
@@ -2882,14 +2827,8 @@
             <w:vAlign w:val="center"/>
           </w:tcPr>
           <w:p>
-            <w:pPr>
-              <w:jc w:val="left"/>
-            </w:pPr>
-            <w:r>
-              <w:rPr>
-                <w:sz w:val="20"/>
-              </w:rPr>
-              <w:t>Hidden size 64; dropout 0.2; early stopping</w:t>
+            <w:r>
+              <w:t>hidden_size=64, seq_len=20, dropout=0.2, lr=0.001, batch_size=64, patience=8, max_epochs=50</w:t>
             </w:r>
           </w:p>
         </w:tc>
@@ -2956,28 +2895,8 @@
             <w:vAlign w:val="center"/>
           </w:tcPr>
           <w:p>
-            <w:pPr>
-              <w:jc w:val="left"/>
-            </w:pPr>
-            <w:r>
-              <w:rPr>
-                <w:sz w:val="20"/>
-              </w:rPr>
-              <w:t xml:space="preserve">L2 </w:t>
-            </w:r>
-            <w:proofErr w:type="spellStart"/>
-            <w:r>
-              <w:rPr>
-                <w:sz w:val="20"/>
-              </w:rPr>
-              <w:t>regularisation</w:t>
-            </w:r>
-            <w:proofErr w:type="spellEnd"/>
-            <w:r>
-              <w:rPr>
-                <w:sz w:val="20"/>
-              </w:rPr>
-              <w:t xml:space="preserve"> on five-model probability vector</w:t>
+            <w:r>
+              <w:t>C=1.0 (L2), max_iter=1000; trained on out-of-fold base-learner probabilities</w:t>
             </w:r>
           </w:p>
         </w:tc>
@@ -5700,11 +5619,50 @@
         <w:ind w:firstLine="360"/>
       </w:pPr>
       <w:r>
-        <w:t xml:space="preserve">Within the High-VIX subset, the mean predicted Up probability on Up-predicted days is 0.574 +/- 0.029, compared with 0.551 +/- 0.039 on Low-VIX Up-predicted days. The difference is not large enough to claim perfect calibration, but it is directionally consistent with the broader result: the ensemble becomes more decisive when volatility is elevated. This is plausible because features such as ATR-14, Bollinger width, MACD dispersion, and recent return lags tend to </w:t>
-      </w:r>
-      <w:r>
-        <w:lastRenderedPageBreak/>
-        <w:t>express stronger contrasts when the market is undergoing a sustained high-uncertainty episode rather than drifting quietly.</w:t>
+        <w:t>Within the High-VIX subset, the mean predicted Up probability on Up-predicted days is 0.574 +/- 0.029, compared with 0.551 +/- 0.039 on Low-VIX Up-predicted days. The difference is not large enough to claim perfect calibration, but it is directionally consistent with the broader result: the ensemble becomes more decisive when volatility is elevated. Regime-specific SHAP analysis (mean absolute SHAP value, XGBoost, 21-day horizon; High-VIX n=8, Low-VIX n=248, both sparse and this-sample-only) shows bb_upper as the single dominant feature in both regimes (0.394 High-VIX vs 0.339 Low-VIX). Beyond that, the regime shift runs in both directions: macd_signal, ema20, and macd become relatively more important in High-VIX, while atr14 (0.019 vs 0.212) and bb_width (0.023 vs 0.091) become markedly less important in High-VIX than in Low-VIX -- the opposite of a simple 'volatility features matter more when volatility is high' story. We revise our earlier, more categorical claim accordingly: the regime shift in feature importance is real but feature-specific, not a uniform amplification of volatility indicators, and should be read with the same n=8 sparsity caveat as the accuracy results.</w:t>
+      </w:r>
+      <w:r/>
+    </w:p>
+    <w:p>
+      <w:pPr/>
+      <w:r>
+        <w:drawing>
+          <wp:inline xmlns:a="http://schemas.openxmlformats.org/drawingml/2006/main" xmlns:pic="http://schemas.openxmlformats.org/drawingml/2006/picture">
+            <wp:extent cx="5303520" cy="3148518"/>
+            <wp:docPr id="529019808" name="Picture 529019808"/>
+            <wp:cNvGraphicFramePr>
+              <a:graphicFrameLocks noChangeAspect="1"/>
+            </wp:cNvGraphicFramePr>
+            <a:graphic>
+              <a:graphicData uri="http://schemas.openxmlformats.org/drawingml/2006/picture">
+                <pic:pic>
+                  <pic:nvPicPr>
+                    <pic:cNvPr id="0" name="R07_shap_regime_comparison.png"/>
+                    <pic:cNvPicPr/>
+                  </pic:nvPicPr>
+                  <pic:blipFill>
+                    <a:blip r:embed="rId21"/>
+                    <a:stretch>
+                      <a:fillRect/>
+                    </a:stretch>
+                  </pic:blipFill>
+                  <pic:spPr>
+                    <a:xfrm>
+                      <a:off x="0" y="0"/>
+                      <a:ext cx="5303520" cy="3148518"/>
+                    </a:xfrm>
+                    <a:prstGeom prst="rect"/>
+                  </pic:spPr>
+                </pic:pic>
+              </a:graphicData>
+            </a:graphic>
+          </wp:inline>
+        </w:drawing>
+      </w:r>
+    </w:p>
+    <w:p>
+      <w:r>
+        <w:t>Fig. 11. Regime-specific SHAP feature importance (mean |SHAP|, XGBoost, 21-day horizon; High-VIX n=8, Low-VIX n=248).</w:t>
       </w:r>
     </w:p>
     <w:p>
@@ -7873,7 +7831,7 @@
         <w:ind w:firstLine="360"/>
       </w:pPr>
       <w:r>
-        <w:t>The empirical pattern suggests a simple economic narrative. When India VIX is elevated, the market is processing macro or policy uncertainty that affects bank-sensitive risk expectations over more than one or two sessions. During those windows, technical features such as Bollinger width, ATR, MACD dispersion, and lagged returns become more informative because they encode persistent state changes rather than routine noise. In calm periods, the same indicators remain observable but far less discriminative. The ensemble is therefore not discovering a universal technical edge; it is exploiting the fact that the market becomes more structurally directional when uncertainty rises and diffuses through prices over several weeks.</w:t>
+        <w:t>The empirical pattern is more nuanced than a simple economic narrative would suggest. Regime-specific SHAP analysis (Section 5.4) shows that Bollinger-band and moving-average features (bb_upper, macd_signal, ema20, macd) become relatively more important in the High-VIX subset, but ATR-14 and Bollinger width -- the two features most directly built to measure realized dispersion -- become markedly *less* important in High-VIX than in Low-VIX. This rules out a simple story in which volatility-sensitive features uniformly encode more signal when volatility is elevated. A more cautious reading is that the feature-importance profile does shift between regimes, but which features gain and lose importance is feature-specific and, given the High-VIX subset has only eight observations, this shift itself should be treated as suggestive rather than established.</w:t>
       </w:r>
     </w:p>
     <w:p>

</xml_diff>

<commit_message>
Add missing Walk-Forward Generalizability (6.4) and Ablation Study (6.6) sections with real data/tables/figures; renumber Cross-pipeline replication to 6.5
</commit_message>
<xml_diff>
--- a/Manuscript/Major_Revision_02_/Manuscript_26082026.docx
+++ b/Manuscript/Major_Revision_02_/Manuscript_26082026.docx
@@ -7767,13 +7767,598 @@
         <w:pStyle w:val="Heading2"/>
       </w:pPr>
       <w:r>
-        <w:rPr>
-          <w:rFonts w:ascii="Times New Roman" w:hAnsi="Times New Roman"/>
-        </w:rPr>
-        <w:t>6.4. Cross-pipeline replication</w:t>
+        <w:t>6.4. Walk-forward generalizability</w:t>
       </w:r>
     </w:p>
     <w:p>
+      <w:r>
+        <w:t>Because the 8 High-VIX test observations are concentrated within a single episode, we additionally report an annual walk-forward analysis (Reviewer #1.3, #2.2): for each year Y, the model is trained on all data up to Y and evaluated on year Y+1, with the regime threshold recalibrated from the corresponding pre-test window at each step. This directly tests whether the High-VIX accuracy advantage is a general regime effect or an artifact of the single 2025 stress episode used in the primary evaluation.</w:t>
+      </w:r>
+    </w:p>
+    <w:p>
+      <w:r>
+        <w:t>Table 12. Year-by-year walk-forward regime accuracy (XGBoost base learner, 21-day horizon; 2023 used as the validation-boundary year and excluded).</w:t>
+      </w:r>
+    </w:p>
+    <w:tbl>
+      <w:tblPr>
+        <w:tblStyle w:val="TableGrid"/>
+        <w:tblW w:type="auto" w:w="0"/>
+        <w:tblLook w:firstColumn="1" w:firstRow="1" w:lastColumn="0" w:lastRow="0" w:noHBand="0" w:noVBand="1" w:val="04A0"/>
+      </w:tblPr>
+      <w:tblGrid>
+        <w:gridCol w:w="1337"/>
+        <w:gridCol w:w="1337"/>
+        <w:gridCol w:w="1337"/>
+        <w:gridCol w:w="1337"/>
+        <w:gridCol w:w="1337"/>
+        <w:gridCol w:w="1337"/>
+        <w:gridCol w:w="1337"/>
+      </w:tblGrid>
+      <w:tr>
+        <w:tc>
+          <w:tcPr>
+            <w:tcW w:type="dxa" w:w="1337"/>
+          </w:tcPr>
+          <w:p>
+            <w:r>
+              <w:t>Test year</w:t>
+            </w:r>
+          </w:p>
+        </w:tc>
+        <w:tc>
+          <w:tcPr>
+            <w:tcW w:type="dxa" w:w="1337"/>
+          </w:tcPr>
+          <w:p>
+            <w:r>
+              <w:t>High-VIX n</w:t>
+            </w:r>
+          </w:p>
+        </w:tc>
+        <w:tc>
+          <w:tcPr>
+            <w:tcW w:type="dxa" w:w="1337"/>
+          </w:tcPr>
+          <w:p>
+            <w:r>
+              <w:t>Low-VIX n</w:t>
+            </w:r>
+          </w:p>
+        </w:tc>
+        <w:tc>
+          <w:tcPr>
+            <w:tcW w:type="dxa" w:w="1337"/>
+          </w:tcPr>
+          <w:p>
+            <w:r>
+              <w:t>High-VIX Acc</w:t>
+            </w:r>
+          </w:p>
+        </w:tc>
+        <w:tc>
+          <w:tcPr>
+            <w:tcW w:type="dxa" w:w="1337"/>
+          </w:tcPr>
+          <w:p>
+            <w:r>
+              <w:t>Low-VIX Acc</w:t>
+            </w:r>
+          </w:p>
+        </w:tc>
+        <w:tc>
+          <w:tcPr>
+            <w:tcW w:type="dxa" w:w="1337"/>
+          </w:tcPr>
+          <w:p>
+            <w:r>
+              <w:t>Diff (pp)</w:t>
+            </w:r>
+          </w:p>
+        </w:tc>
+        <w:tc>
+          <w:tcPr>
+            <w:tcW w:type="dxa" w:w="1337"/>
+          </w:tcPr>
+          <w:p>
+            <w:r>
+              <w:t>High &gt; Low</w:t>
+            </w:r>
+          </w:p>
+        </w:tc>
+      </w:tr>
+      <w:tr>
+        <w:tc>
+          <w:tcPr>
+            <w:tcW w:type="dxa" w:w="1337"/>
+          </w:tcPr>
+          <w:p>
+            <w:r>
+              <w:t>2019</w:t>
+            </w:r>
+          </w:p>
+        </w:tc>
+        <w:tc>
+          <w:tcPr>
+            <w:tcW w:type="dxa" w:w="1337"/>
+          </w:tcPr>
+          <w:p>
+            <w:r>
+              <w:t>33</w:t>
+            </w:r>
+          </w:p>
+        </w:tc>
+        <w:tc>
+          <w:tcPr>
+            <w:tcW w:type="dxa" w:w="1337"/>
+          </w:tcPr>
+          <w:p>
+            <w:r>
+              <w:t>209</w:t>
+            </w:r>
+          </w:p>
+        </w:tc>
+        <w:tc>
+          <w:tcPr>
+            <w:tcW w:type="dxa" w:w="1337"/>
+          </w:tcPr>
+          <w:p>
+            <w:r>
+              <w:t>30.3%</w:t>
+            </w:r>
+          </w:p>
+        </w:tc>
+        <w:tc>
+          <w:tcPr>
+            <w:tcW w:type="dxa" w:w="1337"/>
+          </w:tcPr>
+          <w:p>
+            <w:r>
+              <w:t>52.6%</w:t>
+            </w:r>
+          </w:p>
+        </w:tc>
+        <w:tc>
+          <w:tcPr>
+            <w:tcW w:type="dxa" w:w="1337"/>
+          </w:tcPr>
+          <w:p>
+            <w:r>
+              <w:t>-22.3</w:t>
+            </w:r>
+          </w:p>
+        </w:tc>
+        <w:tc>
+          <w:tcPr>
+            <w:tcW w:type="dxa" w:w="1337"/>
+          </w:tcPr>
+          <w:p>
+            <w:r>
+              <w:t>No</w:t>
+            </w:r>
+          </w:p>
+        </w:tc>
+      </w:tr>
+      <w:tr>
+        <w:tc>
+          <w:tcPr>
+            <w:tcW w:type="dxa" w:w="1337"/>
+          </w:tcPr>
+          <w:p>
+            <w:r>
+              <w:t>2020</w:t>
+            </w:r>
+          </w:p>
+        </w:tc>
+        <w:tc>
+          <w:tcPr>
+            <w:tcW w:type="dxa" w:w="1337"/>
+          </w:tcPr>
+          <w:p>
+            <w:r>
+              <w:t>203</w:t>
+            </w:r>
+          </w:p>
+        </w:tc>
+        <w:tc>
+          <w:tcPr>
+            <w:tcW w:type="dxa" w:w="1337"/>
+          </w:tcPr>
+          <w:p>
+            <w:r>
+              <w:t>46</w:t>
+            </w:r>
+          </w:p>
+        </w:tc>
+        <w:tc>
+          <w:tcPr>
+            <w:tcW w:type="dxa" w:w="1337"/>
+          </w:tcPr>
+          <w:p>
+            <w:r>
+              <w:t>66.0%</w:t>
+            </w:r>
+          </w:p>
+        </w:tc>
+        <w:tc>
+          <w:tcPr>
+            <w:tcW w:type="dxa" w:w="1337"/>
+          </w:tcPr>
+          <w:p>
+            <w:r>
+              <w:t>89.1%</w:t>
+            </w:r>
+          </w:p>
+        </w:tc>
+        <w:tc>
+          <w:tcPr>
+            <w:tcW w:type="dxa" w:w="1337"/>
+          </w:tcPr>
+          <w:p>
+            <w:r>
+              <w:t>-23.1</w:t>
+            </w:r>
+          </w:p>
+        </w:tc>
+        <w:tc>
+          <w:tcPr>
+            <w:tcW w:type="dxa" w:w="1337"/>
+          </w:tcPr>
+          <w:p>
+            <w:r>
+              <w:t>No</w:t>
+            </w:r>
+          </w:p>
+        </w:tc>
+      </w:tr>
+      <w:tr>
+        <w:tc>
+          <w:tcPr>
+            <w:tcW w:type="dxa" w:w="1337"/>
+          </w:tcPr>
+          <w:p>
+            <w:r>
+              <w:t>2021</w:t>
+            </w:r>
+          </w:p>
+        </w:tc>
+        <w:tc>
+          <w:tcPr>
+            <w:tcW w:type="dxa" w:w="1337"/>
+          </w:tcPr>
+          <w:p>
+            <w:r>
+              <w:t>97</w:t>
+            </w:r>
+          </w:p>
+        </w:tc>
+        <w:tc>
+          <w:tcPr>
+            <w:tcW w:type="dxa" w:w="1337"/>
+          </w:tcPr>
+          <w:p>
+            <w:r>
+              <w:t>141</w:t>
+            </w:r>
+          </w:p>
+        </w:tc>
+        <w:tc>
+          <w:tcPr>
+            <w:tcW w:type="dxa" w:w="1337"/>
+          </w:tcPr>
+          <w:p>
+            <w:r>
+              <w:t>35.1%</w:t>
+            </w:r>
+          </w:p>
+        </w:tc>
+        <w:tc>
+          <w:tcPr>
+            <w:tcW w:type="dxa" w:w="1337"/>
+          </w:tcPr>
+          <w:p>
+            <w:r>
+              <w:t>22.7%</w:t>
+            </w:r>
+          </w:p>
+        </w:tc>
+        <w:tc>
+          <w:tcPr>
+            <w:tcW w:type="dxa" w:w="1337"/>
+          </w:tcPr>
+          <w:p>
+            <w:r>
+              <w:t>+12.4</w:t>
+            </w:r>
+          </w:p>
+        </w:tc>
+        <w:tc>
+          <w:tcPr>
+            <w:tcW w:type="dxa" w:w="1337"/>
+          </w:tcPr>
+          <w:p>
+            <w:r>
+              <w:t>Yes</w:t>
+            </w:r>
+          </w:p>
+        </w:tc>
+      </w:tr>
+      <w:tr>
+        <w:tc>
+          <w:tcPr>
+            <w:tcW w:type="dxa" w:w="1337"/>
+          </w:tcPr>
+          <w:p>
+            <w:r>
+              <w:t>2022</w:t>
+            </w:r>
+          </w:p>
+        </w:tc>
+        <w:tc>
+          <w:tcPr>
+            <w:tcW w:type="dxa" w:w="1337"/>
+          </w:tcPr>
+          <w:p>
+            <w:r>
+              <w:t>132</w:t>
+            </w:r>
+          </w:p>
+        </w:tc>
+        <w:tc>
+          <w:tcPr>
+            <w:tcW w:type="dxa" w:w="1337"/>
+          </w:tcPr>
+          <w:p>
+            <w:r>
+              <w:t>115</w:t>
+            </w:r>
+          </w:p>
+        </w:tc>
+        <w:tc>
+          <w:tcPr>
+            <w:tcW w:type="dxa" w:w="1337"/>
+          </w:tcPr>
+          <w:p>
+            <w:r>
+              <w:t>43.2%</w:t>
+            </w:r>
+          </w:p>
+        </w:tc>
+        <w:tc>
+          <w:tcPr>
+            <w:tcW w:type="dxa" w:w="1337"/>
+          </w:tcPr>
+          <w:p>
+            <w:r>
+              <w:t>54.8%</w:t>
+            </w:r>
+          </w:p>
+        </w:tc>
+        <w:tc>
+          <w:tcPr>
+            <w:tcW w:type="dxa" w:w="1337"/>
+          </w:tcPr>
+          <w:p>
+            <w:r>
+              <w:t>-11.6</w:t>
+            </w:r>
+          </w:p>
+        </w:tc>
+        <w:tc>
+          <w:tcPr>
+            <w:tcW w:type="dxa" w:w="1337"/>
+          </w:tcPr>
+          <w:p>
+            <w:r>
+              <w:t>No</w:t>
+            </w:r>
+          </w:p>
+        </w:tc>
+      </w:tr>
+      <w:tr>
+        <w:tc>
+          <w:tcPr>
+            <w:tcW w:type="dxa" w:w="1337"/>
+          </w:tcPr>
+          <w:p>
+            <w:r>
+              <w:t>2024</w:t>
+            </w:r>
+          </w:p>
+        </w:tc>
+        <w:tc>
+          <w:tcPr>
+            <w:tcW w:type="dxa" w:w="1337"/>
+          </w:tcPr>
+          <w:p>
+            <w:r>
+              <w:t>19</w:t>
+            </w:r>
+          </w:p>
+        </w:tc>
+        <w:tc>
+          <w:tcPr>
+            <w:tcW w:type="dxa" w:w="1337"/>
+          </w:tcPr>
+          <w:p>
+            <w:r>
+              <w:t>225</w:t>
+            </w:r>
+          </w:p>
+        </w:tc>
+        <w:tc>
+          <w:tcPr>
+            <w:tcW w:type="dxa" w:w="1337"/>
+          </w:tcPr>
+          <w:p>
+            <w:r>
+              <w:t>10.5%</w:t>
+            </w:r>
+          </w:p>
+        </w:tc>
+        <w:tc>
+          <w:tcPr>
+            <w:tcW w:type="dxa" w:w="1337"/>
+          </w:tcPr>
+          <w:p>
+            <w:r>
+              <w:t>49.8%</w:t>
+            </w:r>
+          </w:p>
+        </w:tc>
+        <w:tc>
+          <w:tcPr>
+            <w:tcW w:type="dxa" w:w="1337"/>
+          </w:tcPr>
+          <w:p>
+            <w:r>
+              <w:t>-39.3</w:t>
+            </w:r>
+          </w:p>
+        </w:tc>
+        <w:tc>
+          <w:tcPr>
+            <w:tcW w:type="dxa" w:w="1337"/>
+          </w:tcPr>
+          <w:p>
+            <w:r>
+              <w:t>No</w:t>
+            </w:r>
+          </w:p>
+        </w:tc>
+      </w:tr>
+      <w:tr>
+        <w:tc>
+          <w:tcPr>
+            <w:tcW w:type="dxa" w:w="1337"/>
+          </w:tcPr>
+          <w:p>
+            <w:r>
+              <w:t>2025</w:t>
+            </w:r>
+          </w:p>
+        </w:tc>
+        <w:tc>
+          <w:tcPr>
+            <w:tcW w:type="dxa" w:w="1337"/>
+          </w:tcPr>
+          <w:p>
+            <w:r>
+              <w:t>8</w:t>
+            </w:r>
+          </w:p>
+        </w:tc>
+        <w:tc>
+          <w:tcPr>
+            <w:tcW w:type="dxa" w:w="1337"/>
+          </w:tcPr>
+          <w:p>
+            <w:r>
+              <w:t>239</w:t>
+            </w:r>
+          </w:p>
+        </w:tc>
+        <w:tc>
+          <w:tcPr>
+            <w:tcW w:type="dxa" w:w="1337"/>
+          </w:tcPr>
+          <w:p>
+            <w:r>
+              <w:t>12.5%</w:t>
+            </w:r>
+          </w:p>
+        </w:tc>
+        <w:tc>
+          <w:tcPr>
+            <w:tcW w:type="dxa" w:w="1337"/>
+          </w:tcPr>
+          <w:p>
+            <w:r>
+              <w:t>43.9%</w:t>
+            </w:r>
+          </w:p>
+        </w:tc>
+        <w:tc>
+          <w:tcPr>
+            <w:tcW w:type="dxa" w:w="1337"/>
+          </w:tcPr>
+          <w:p>
+            <w:r>
+              <w:t>-31.4</w:t>
+            </w:r>
+          </w:p>
+        </w:tc>
+        <w:tc>
+          <w:tcPr>
+            <w:tcW w:type="dxa" w:w="1337"/>
+          </w:tcPr>
+          <w:p>
+            <w:r>
+              <w:t>No</w:t>
+            </w:r>
+          </w:p>
+        </w:tc>
+      </w:tr>
+    </w:tbl>
+    <w:p/>
+    <w:p>
+      <w:r>
+        <w:drawing>
+          <wp:inline xmlns:a="http://schemas.openxmlformats.org/drawingml/2006/main" xmlns:pic="http://schemas.openxmlformats.org/drawingml/2006/picture">
+            <wp:extent cx="5303520" cy="2612448"/>
+            <wp:docPr id="529019809" name="Picture 529019809"/>
+            <wp:cNvGraphicFramePr>
+              <a:graphicFrameLocks noChangeAspect="1"/>
+            </wp:cNvGraphicFramePr>
+            <a:graphic>
+              <a:graphicData uri="http://schemas.openxmlformats.org/drawingml/2006/picture">
+                <pic:pic>
+                  <pic:nvPicPr>
+                    <pic:cNvPr id="0" name="R05_walkforward_regime_accuracy.png"/>
+                    <pic:cNvPicPr/>
+                  </pic:nvPicPr>
+                  <pic:blipFill>
+                    <a:blip r:embed="rId22"/>
+                    <a:stretch>
+                      <a:fillRect/>
+                    </a:stretch>
+                  </pic:blipFill>
+                  <pic:spPr>
+                    <a:xfrm>
+                      <a:off x="0" y="0"/>
+                      <a:ext cx="5303520" cy="2612448"/>
+                    </a:xfrm>
+                    <a:prstGeom prst="rect"/>
+                  </pic:spPr>
+                </pic:pic>
+              </a:graphicData>
+            </a:graphic>
+          </wp:inline>
+        </w:drawing>
+      </w:r>
+    </w:p>
+    <w:p>
+      <w:r>
+        <w:t>Fig. 12. Walk-forward regime accuracy by test year (High-VIX vs Low-VIX, 21-day horizon).</w:t>
+      </w:r>
+    </w:p>
+    <w:p>
+      <w:r>
+        <w:t>The walk-forward result is the most direct test of generalizability available in this study, and it does not support a general High-VIX advantage: across six independently evaluated years, High-VIX accuracy exceeds Low-VIX accuracy in only one year (2021), and underperforms it by 11-39 percentage points in the other five. This is consistent with the primary test-period finding being concentrated in, and potentially specific to, the 2025 stress episode rather than reflecting a stable regime-conditional relationship. We regard this as the single most important robustness result in the paper: it directly tempers the primary 100.0% vs 66.5% finding and is the main reason we present the regime effect as a conditional, sample-specific pattern rather than a general predictive-skill result.</w:t>
+      </w:r>
+    </w:p>
+    <w:p>
+      <w:pPr>
+        <w:pStyle w:val="Heading2"/>
+      </w:pPr>
+      <w:r>
+        <w:rPr>
+          <w:rFonts w:ascii="Times New Roman" w:hAnsi="Times New Roman"/>
+        </w:rPr>
+        <w:t>6.5. Cross-pipeline replication</w:t>
+      </w:r>
+    </w:p>
+    <w:p>
       <w:pPr>
         <w:spacing w:after="80" w:line="360" w:lineRule="auto"/>
         <w:ind w:firstLine="360"/>
@@ -7814,6 +8399,462 @@
       </w:r>
     </w:p>
     <w:p/>
+    <w:p>
+      <w:pPr>
+        <w:pStyle w:val="Heading2"/>
+      </w:pPr>
+      <w:r>
+        <w:t>6.6. Ablation study</w:t>
+      </w:r>
+    </w:p>
+    <w:p>
+      <w:r>
+        <w:t>To assess whether the ensemble's complexity is justified (Reviewer #3.4), we evaluate each base learner individually and two partial-stack configurations (trees-only, i.e. XGBoost+LightGBM+Random Forest+CatBoost without the BiLSTM; and the full five-model stack) under the identical corrected regime split. High-VIX accuracy is not informative for this comparison because the subset (n=8) is single-class and dominated by whichever configuration happens to predict Up on all eight days; the Low-VIX (n=228) and Overall (n=236) columns are the meaningful comparison.</w:t>
+      </w:r>
+    </w:p>
+    <w:p>
+      <w:r>
+        <w:t>Table 13. Ablation study: accuracy by model configuration and regime (21-day horizon).</w:t>
+      </w:r>
+    </w:p>
+    <w:tbl>
+      <w:tblPr>
+        <w:tblStyle w:val="TableGrid"/>
+        <w:tblW w:type="auto" w:w="0"/>
+        <w:tblLook w:firstColumn="1" w:firstRow="1" w:lastColumn="0" w:lastRow="0" w:noHBand="0" w:noVBand="1" w:val="04A0"/>
+      </w:tblPr>
+      <w:tblGrid>
+        <w:gridCol w:w="2340"/>
+        <w:gridCol w:w="2340"/>
+        <w:gridCol w:w="2340"/>
+        <w:gridCol w:w="2340"/>
+      </w:tblGrid>
+      <w:tr>
+        <w:tc>
+          <w:tcPr>
+            <w:tcW w:type="dxa" w:w="2340"/>
+          </w:tcPr>
+          <w:p>
+            <w:r>
+              <w:t>Configuration</w:t>
+            </w:r>
+          </w:p>
+        </w:tc>
+        <w:tc>
+          <w:tcPr>
+            <w:tcW w:type="dxa" w:w="2340"/>
+          </w:tcPr>
+          <w:p>
+            <w:r>
+              <w:t>High-VIX Acc (n=8)</w:t>
+            </w:r>
+          </w:p>
+        </w:tc>
+        <w:tc>
+          <w:tcPr>
+            <w:tcW w:type="dxa" w:w="2340"/>
+          </w:tcPr>
+          <w:p>
+            <w:r>
+              <w:t>Low-VIX Acc (n=228)</w:t>
+            </w:r>
+          </w:p>
+        </w:tc>
+        <w:tc>
+          <w:tcPr>
+            <w:tcW w:type="dxa" w:w="2340"/>
+          </w:tcPr>
+          <w:p>
+            <w:r>
+              <w:t>Overall Acc (n=236)</w:t>
+            </w:r>
+          </w:p>
+        </w:tc>
+      </w:tr>
+      <w:tr>
+        <w:tc>
+          <w:tcPr>
+            <w:tcW w:type="dxa" w:w="2340"/>
+          </w:tcPr>
+          <w:p>
+            <w:r>
+              <w:t>XGBoost only</w:t>
+            </w:r>
+          </w:p>
+        </w:tc>
+        <w:tc>
+          <w:tcPr>
+            <w:tcW w:type="dxa" w:w="2340"/>
+          </w:tcPr>
+          <w:p>
+            <w:r>
+              <w:t>0.0%</w:t>
+            </w:r>
+          </w:p>
+        </w:tc>
+        <w:tc>
+          <w:tcPr>
+            <w:tcW w:type="dxa" w:w="2340"/>
+          </w:tcPr>
+          <w:p>
+            <w:r>
+              <w:t>45.2%</w:t>
+            </w:r>
+          </w:p>
+        </w:tc>
+        <w:tc>
+          <w:tcPr>
+            <w:tcW w:type="dxa" w:w="2340"/>
+          </w:tcPr>
+          <w:p>
+            <w:r>
+              <w:t>43.6%</w:t>
+            </w:r>
+          </w:p>
+        </w:tc>
+      </w:tr>
+      <w:tr>
+        <w:tc>
+          <w:tcPr>
+            <w:tcW w:type="dxa" w:w="2340"/>
+          </w:tcPr>
+          <w:p>
+            <w:r>
+              <w:t>LightGBM only</w:t>
+            </w:r>
+          </w:p>
+        </w:tc>
+        <w:tc>
+          <w:tcPr>
+            <w:tcW w:type="dxa" w:w="2340"/>
+          </w:tcPr>
+          <w:p>
+            <w:r>
+              <w:t>0.0%</w:t>
+            </w:r>
+          </w:p>
+        </w:tc>
+        <w:tc>
+          <w:tcPr>
+            <w:tcW w:type="dxa" w:w="2340"/>
+          </w:tcPr>
+          <w:p>
+            <w:r>
+              <w:t>48.7%</w:t>
+            </w:r>
+          </w:p>
+        </w:tc>
+        <w:tc>
+          <w:tcPr>
+            <w:tcW w:type="dxa" w:w="2340"/>
+          </w:tcPr>
+          <w:p>
+            <w:r>
+              <w:t>47.0%</w:t>
+            </w:r>
+          </w:p>
+        </w:tc>
+      </w:tr>
+      <w:tr>
+        <w:tc>
+          <w:tcPr>
+            <w:tcW w:type="dxa" w:w="2340"/>
+          </w:tcPr>
+          <w:p>
+            <w:r>
+              <w:t>Random Forest only</w:t>
+            </w:r>
+          </w:p>
+        </w:tc>
+        <w:tc>
+          <w:tcPr>
+            <w:tcW w:type="dxa" w:w="2340"/>
+          </w:tcPr>
+          <w:p>
+            <w:r>
+              <w:t>62.5%</w:t>
+            </w:r>
+          </w:p>
+        </w:tc>
+        <w:tc>
+          <w:tcPr>
+            <w:tcW w:type="dxa" w:w="2340"/>
+          </w:tcPr>
+          <w:p>
+            <w:r>
+              <w:t>48.7%</w:t>
+            </w:r>
+          </w:p>
+        </w:tc>
+        <w:tc>
+          <w:tcPr>
+            <w:tcW w:type="dxa" w:w="2340"/>
+          </w:tcPr>
+          <w:p>
+            <w:r>
+              <w:t>49.2%</w:t>
+            </w:r>
+          </w:p>
+        </w:tc>
+      </w:tr>
+      <w:tr>
+        <w:tc>
+          <w:tcPr>
+            <w:tcW w:type="dxa" w:w="2340"/>
+          </w:tcPr>
+          <w:p>
+            <w:r>
+              <w:t>CatBoost only</w:t>
+            </w:r>
+          </w:p>
+        </w:tc>
+        <w:tc>
+          <w:tcPr>
+            <w:tcW w:type="dxa" w:w="2340"/>
+          </w:tcPr>
+          <w:p>
+            <w:r>
+              <w:t>0.0%</w:t>
+            </w:r>
+          </w:p>
+        </w:tc>
+        <w:tc>
+          <w:tcPr>
+            <w:tcW w:type="dxa" w:w="2340"/>
+          </w:tcPr>
+          <w:p>
+            <w:r>
+              <w:t>49.6%</w:t>
+            </w:r>
+          </w:p>
+        </w:tc>
+        <w:tc>
+          <w:tcPr>
+            <w:tcW w:type="dxa" w:w="2340"/>
+          </w:tcPr>
+          <w:p>
+            <w:r>
+              <w:t>47.9%</w:t>
+            </w:r>
+          </w:p>
+        </w:tc>
+      </w:tr>
+      <w:tr>
+        <w:tc>
+          <w:tcPr>
+            <w:tcW w:type="dxa" w:w="2340"/>
+          </w:tcPr>
+          <w:p>
+            <w:r>
+              <w:t>BiLSTM+Attention only</w:t>
+            </w:r>
+          </w:p>
+        </w:tc>
+        <w:tc>
+          <w:tcPr>
+            <w:tcW w:type="dxa" w:w="2340"/>
+          </w:tcPr>
+          <w:p>
+            <w:r>
+              <w:t>0.0%</w:t>
+            </w:r>
+          </w:p>
+        </w:tc>
+        <w:tc>
+          <w:tcPr>
+            <w:tcW w:type="dxa" w:w="2340"/>
+          </w:tcPr>
+          <w:p>
+            <w:r>
+              <w:t>51.8%</w:t>
+            </w:r>
+          </w:p>
+        </w:tc>
+        <w:tc>
+          <w:tcPr>
+            <w:tcW w:type="dxa" w:w="2340"/>
+          </w:tcPr>
+          <w:p>
+            <w:r>
+              <w:t>50.0%</w:t>
+            </w:r>
+          </w:p>
+        </w:tc>
+      </w:tr>
+      <w:tr>
+        <w:tc>
+          <w:tcPr>
+            <w:tcW w:type="dxa" w:w="2340"/>
+          </w:tcPr>
+          <w:p>
+            <w:r>
+              <w:t>BiLSTM (no attention)</w:t>
+            </w:r>
+          </w:p>
+        </w:tc>
+        <w:tc>
+          <w:tcPr>
+            <w:tcW w:type="dxa" w:w="2340"/>
+          </w:tcPr>
+          <w:p>
+            <w:r>
+              <w:t>0.0%</w:t>
+            </w:r>
+          </w:p>
+        </w:tc>
+        <w:tc>
+          <w:tcPr>
+            <w:tcW w:type="dxa" w:w="2340"/>
+          </w:tcPr>
+          <w:p>
+            <w:r>
+              <w:t>55.3%</w:t>
+            </w:r>
+          </w:p>
+        </w:tc>
+        <w:tc>
+          <w:tcPr>
+            <w:tcW w:type="dxa" w:w="2340"/>
+          </w:tcPr>
+          <w:p>
+            <w:r>
+              <w:t>53.4%</w:t>
+            </w:r>
+          </w:p>
+        </w:tc>
+      </w:tr>
+      <w:tr>
+        <w:tc>
+          <w:tcPr>
+            <w:tcW w:type="dxa" w:w="2340"/>
+          </w:tcPr>
+          <w:p>
+            <w:r>
+              <w:t>Stack (trees only, no BiLSTM)</w:t>
+            </w:r>
+          </w:p>
+        </w:tc>
+        <w:tc>
+          <w:tcPr>
+            <w:tcW w:type="dxa" w:w="2340"/>
+          </w:tcPr>
+          <w:p>
+            <w:r>
+              <w:t>100.0%</w:t>
+            </w:r>
+          </w:p>
+        </w:tc>
+        <w:tc>
+          <w:tcPr>
+            <w:tcW w:type="dxa" w:w="2340"/>
+          </w:tcPr>
+          <w:p>
+            <w:r>
+              <w:t>66.7%</w:t>
+            </w:r>
+          </w:p>
+        </w:tc>
+        <w:tc>
+          <w:tcPr>
+            <w:tcW w:type="dxa" w:w="2340"/>
+          </w:tcPr>
+          <w:p>
+            <w:r>
+              <w:t>67.8%</w:t>
+            </w:r>
+          </w:p>
+        </w:tc>
+      </w:tr>
+      <w:tr>
+        <w:tc>
+          <w:tcPr>
+            <w:tcW w:type="dxa" w:w="2340"/>
+          </w:tcPr>
+          <w:p>
+            <w:r>
+              <w:t>Stack (full, all 5 learners)</w:t>
+            </w:r>
+          </w:p>
+        </w:tc>
+        <w:tc>
+          <w:tcPr>
+            <w:tcW w:type="dxa" w:w="2340"/>
+          </w:tcPr>
+          <w:p>
+            <w:r>
+              <w:t>100.0%</w:t>
+            </w:r>
+          </w:p>
+        </w:tc>
+        <w:tc>
+          <w:tcPr>
+            <w:tcW w:type="dxa" w:w="2340"/>
+          </w:tcPr>
+          <w:p>
+            <w:r>
+              <w:t>64.9%</w:t>
+            </w:r>
+          </w:p>
+        </w:tc>
+        <w:tc>
+          <w:tcPr>
+            <w:tcW w:type="dxa" w:w="2340"/>
+          </w:tcPr>
+          <w:p>
+            <w:r>
+              <w:t>66.1%</w:t>
+            </w:r>
+          </w:p>
+        </w:tc>
+      </w:tr>
+    </w:tbl>
+    <w:p/>
+    <w:p>
+      <w:r>
+        <w:drawing>
+          <wp:inline xmlns:a="http://schemas.openxmlformats.org/drawingml/2006/main" xmlns:pic="http://schemas.openxmlformats.org/drawingml/2006/picture">
+            <wp:extent cx="5303520" cy="2610688"/>
+            <wp:docPr id="529019810" name="Picture 529019810"/>
+            <wp:cNvGraphicFramePr>
+              <a:graphicFrameLocks noChangeAspect="1"/>
+            </wp:cNvGraphicFramePr>
+            <a:graphic>
+              <a:graphicData uri="http://schemas.openxmlformats.org/drawingml/2006/picture">
+                <pic:pic>
+                  <pic:nvPicPr>
+                    <pic:cNvPr id="0" name="R08_ablation_accuracy.png"/>
+                    <pic:cNvPicPr/>
+                  </pic:nvPicPr>
+                  <pic:blipFill>
+                    <a:blip r:embed="rId23"/>
+                    <a:stretch>
+                      <a:fillRect/>
+                    </a:stretch>
+                  </pic:blipFill>
+                  <pic:spPr>
+                    <a:xfrm>
+                      <a:off x="0" y="0"/>
+                      <a:ext cx="5303520" cy="2610688"/>
+                    </a:xfrm>
+                    <a:prstGeom prst="rect"/>
+                  </pic:spPr>
+                </pic:pic>
+              </a:graphicData>
+            </a:graphic>
+          </wp:inline>
+        </w:drawing>
+      </w:r>
+    </w:p>
+    <w:p>
+      <w:r>
+        <w:t>Fig. 13. Ablation study: High-VIX accuracy by configuration. Not informative on its own (n=8, single class) -- see Table 13 for the Low-VIX and Overall columns, which are the meaningful comparison for this ablation.</w:t>
+      </w:r>
+    </w:p>
+    <w:p>
+      <w:r>
+        <w:t>Two findings stand out. First, every individual base learner performs at or below the Low-VIX majority baseline (70.2%), while both stacked configurations exceed it (66.7% and 64.9% are still below 70.2% in absolute terms, but both substantially outperform every single base learner) -- stacking clearly adds value over any individual model, consistent with the motivation for using an ensemble. Second, and less expected, the full five-model stack including the BiLSTM with self-attention slightly underperforms the trees-only stack on both Low-VIX (64.9% vs 66.7%) and Overall (66.1% vs 67.8%) accuracy. This does not support a claim that the self-attention BiLSTM component adds predictive value in this sample; if anything, it introduces mild additional noise into the meta-learner's combination. We report this transparently rather than omit it: it qualifies the architectural framing in Section 3.3 and suggests that a simpler trees-only stack would be a reasonable, and slightly stronger, alternative to the full five-model architecture used here.</w:t>
+      </w:r>
+    </w:p>
     <w:p>
       <w:pPr>
         <w:pStyle w:val="Heading1"/>

</xml_diff>

<commit_message>
Add regime-stratified baseline comparison (Table 6b, Fig 3b) to Section 5.1 per Reviewer #2.3
</commit_message>
<xml_diff>
--- a/Manuscript/Major_Revision_02_/Manuscript_26082026.docx
+++ b/Manuscript/Major_Revision_02_/Manuscript_26082026.docx
@@ -3933,6 +3933,871 @@
       </w:tr>
     </w:tbl>
     <w:p/>
+    <w:p>
+      <w:r>
+        <w:t>To assess whether the stacking ensemble's complexity is justified relative to simpler alternatives under the same regime filter (Reviewer #2.3), Table 6b reports majority-class, naive persistence, logistic regression, and single-model XGBoost baselines, each evaluated on the identical High-VIX/Low-VIX split used for the ensemble.</w:t>
+      </w:r>
+    </w:p>
+    <w:p>
+      <w:r>
+        <w:t>Table 6b. Regime-stratified baseline comparison: simple baselines vs. the stacking ensemble.</w:t>
+      </w:r>
+    </w:p>
+    <w:tbl>
+      <w:tblPr>
+        <w:tblStyle w:val="TableGrid"/>
+        <w:tblW w:type="auto" w:w="0"/>
+        <w:tblLook w:firstColumn="1" w:firstRow="1" w:lastColumn="0" w:lastRow="0" w:noHBand="0" w:noVBand="1" w:val="04A0"/>
+      </w:tblPr>
+      <w:tblGrid>
+        <w:gridCol w:w="1337"/>
+        <w:gridCol w:w="1337"/>
+        <w:gridCol w:w="1337"/>
+        <w:gridCol w:w="1337"/>
+        <w:gridCol w:w="1337"/>
+        <w:gridCol w:w="1337"/>
+        <w:gridCol w:w="1337"/>
+      </w:tblGrid>
+      <w:tr>
+        <w:tc>
+          <w:tcPr>
+            <w:tcW w:type="dxa" w:w="1337"/>
+          </w:tcPr>
+          <w:p>
+            <w:r>
+              <w:t>Model</w:t>
+            </w:r>
+          </w:p>
+        </w:tc>
+        <w:tc>
+          <w:tcPr>
+            <w:tcW w:type="dxa" w:w="1337"/>
+          </w:tcPr>
+          <w:p>
+            <w:r>
+              <w:t>Regime</w:t>
+            </w:r>
+          </w:p>
+        </w:tc>
+        <w:tc>
+          <w:tcPr>
+            <w:tcW w:type="dxa" w:w="1337"/>
+          </w:tcPr>
+          <w:p>
+            <w:r>
+              <w:t>N</w:t>
+            </w:r>
+          </w:p>
+        </w:tc>
+        <w:tc>
+          <w:tcPr>
+            <w:tcW w:type="dxa" w:w="1337"/>
+          </w:tcPr>
+          <w:p>
+            <w:r>
+              <w:t>Majority BL (%)</w:t>
+            </w:r>
+          </w:p>
+        </w:tc>
+        <w:tc>
+          <w:tcPr>
+            <w:tcW w:type="dxa" w:w="1337"/>
+          </w:tcPr>
+          <w:p>
+            <w:r>
+              <w:t>Accuracy (%)</w:t>
+            </w:r>
+          </w:p>
+        </w:tc>
+        <w:tc>
+          <w:tcPr>
+            <w:tcW w:type="dxa" w:w="1337"/>
+          </w:tcPr>
+          <w:p>
+            <w:r>
+              <w:t>F1 (%)</w:t>
+            </w:r>
+          </w:p>
+        </w:tc>
+        <w:tc>
+          <w:tcPr>
+            <w:tcW w:type="dxa" w:w="1337"/>
+          </w:tcPr>
+          <w:p>
+            <w:r>
+              <w:t>AUC</w:t>
+            </w:r>
+          </w:p>
+        </w:tc>
+      </w:tr>
+      <w:tr>
+        <w:tc>
+          <w:tcPr>
+            <w:tcW w:type="dxa" w:w="1337"/>
+          </w:tcPr>
+          <w:p>
+            <w:r>
+              <w:t>Majority-Class</w:t>
+            </w:r>
+          </w:p>
+        </w:tc>
+        <w:tc>
+          <w:tcPr>
+            <w:tcW w:type="dxa" w:w="1337"/>
+          </w:tcPr>
+          <w:p>
+            <w:r>
+              <w:t>High-VIX</w:t>
+            </w:r>
+          </w:p>
+        </w:tc>
+        <w:tc>
+          <w:tcPr>
+            <w:tcW w:type="dxa" w:w="1337"/>
+          </w:tcPr>
+          <w:p>
+            <w:r>
+              <w:t>8</w:t>
+            </w:r>
+          </w:p>
+        </w:tc>
+        <w:tc>
+          <w:tcPr>
+            <w:tcW w:type="dxa" w:w="1337"/>
+          </w:tcPr>
+          <w:p>
+            <w:r>
+              <w:t>100.0</w:t>
+            </w:r>
+          </w:p>
+        </w:tc>
+        <w:tc>
+          <w:tcPr>
+            <w:tcW w:type="dxa" w:w="1337"/>
+          </w:tcPr>
+          <w:p>
+            <w:r>
+              <w:t>100.0</w:t>
+            </w:r>
+          </w:p>
+        </w:tc>
+        <w:tc>
+          <w:tcPr>
+            <w:tcW w:type="dxa" w:w="1337"/>
+          </w:tcPr>
+          <w:p>
+            <w:r>
+              <w:t>100.0</w:t>
+            </w:r>
+          </w:p>
+        </w:tc>
+        <w:tc>
+          <w:tcPr>
+            <w:tcW w:type="dxa" w:w="1337"/>
+          </w:tcPr>
+          <w:p>
+            <w:r>
+              <w:t>N/A</w:t>
+            </w:r>
+          </w:p>
+        </w:tc>
+      </w:tr>
+      <w:tr>
+        <w:tc>
+          <w:tcPr>
+            <w:tcW w:type="dxa" w:w="1337"/>
+          </w:tcPr>
+          <w:p>
+            <w:r>
+              <w:t>Majority-Class</w:t>
+            </w:r>
+          </w:p>
+        </w:tc>
+        <w:tc>
+          <w:tcPr>
+            <w:tcW w:type="dxa" w:w="1337"/>
+          </w:tcPr>
+          <w:p>
+            <w:r>
+              <w:t>Low-VIX</w:t>
+            </w:r>
+          </w:p>
+        </w:tc>
+        <w:tc>
+          <w:tcPr>
+            <w:tcW w:type="dxa" w:w="1337"/>
+          </w:tcPr>
+          <w:p>
+            <w:r>
+              <w:t>248</w:t>
+            </w:r>
+          </w:p>
+        </w:tc>
+        <w:tc>
+          <w:tcPr>
+            <w:tcW w:type="dxa" w:w="1337"/>
+          </w:tcPr>
+          <w:p>
+            <w:r>
+              <w:t>70.2</w:t>
+            </w:r>
+          </w:p>
+        </w:tc>
+        <w:tc>
+          <w:tcPr>
+            <w:tcW w:type="dxa" w:w="1337"/>
+          </w:tcPr>
+          <w:p>
+            <w:r>
+              <w:t>70.2</w:t>
+            </w:r>
+          </w:p>
+        </w:tc>
+        <w:tc>
+          <w:tcPr>
+            <w:tcW w:type="dxa" w:w="1337"/>
+          </w:tcPr>
+          <w:p>
+            <w:r>
+              <w:t>82.5</w:t>
+            </w:r>
+          </w:p>
+        </w:tc>
+        <w:tc>
+          <w:tcPr>
+            <w:tcW w:type="dxa" w:w="1337"/>
+          </w:tcPr>
+          <w:p>
+            <w:r>
+              <w:t>0.500</w:t>
+            </w:r>
+          </w:p>
+        </w:tc>
+      </w:tr>
+      <w:tr>
+        <w:tc>
+          <w:tcPr>
+            <w:tcW w:type="dxa" w:w="1337"/>
+          </w:tcPr>
+          <w:p>
+            <w:r>
+              <w:t>Persistence</w:t>
+            </w:r>
+          </w:p>
+        </w:tc>
+        <w:tc>
+          <w:tcPr>
+            <w:tcW w:type="dxa" w:w="1337"/>
+          </w:tcPr>
+          <w:p>
+            <w:r>
+              <w:t>High-VIX</w:t>
+            </w:r>
+          </w:p>
+        </w:tc>
+        <w:tc>
+          <w:tcPr>
+            <w:tcW w:type="dxa" w:w="1337"/>
+          </w:tcPr>
+          <w:p>
+            <w:r>
+              <w:t>8</w:t>
+            </w:r>
+          </w:p>
+        </w:tc>
+        <w:tc>
+          <w:tcPr>
+            <w:tcW w:type="dxa" w:w="1337"/>
+          </w:tcPr>
+          <w:p>
+            <w:r>
+              <w:t>100.0</w:t>
+            </w:r>
+          </w:p>
+        </w:tc>
+        <w:tc>
+          <w:tcPr>
+            <w:tcW w:type="dxa" w:w="1337"/>
+          </w:tcPr>
+          <w:p>
+            <w:r>
+              <w:t>37.5</w:t>
+            </w:r>
+          </w:p>
+        </w:tc>
+        <w:tc>
+          <w:tcPr>
+            <w:tcW w:type="dxa" w:w="1337"/>
+          </w:tcPr>
+          <w:p>
+            <w:r>
+              <w:t>54.5</w:t>
+            </w:r>
+          </w:p>
+        </w:tc>
+        <w:tc>
+          <w:tcPr>
+            <w:tcW w:type="dxa" w:w="1337"/>
+          </w:tcPr>
+          <w:p>
+            <w:r>
+              <w:t>N/A</w:t>
+            </w:r>
+          </w:p>
+        </w:tc>
+      </w:tr>
+      <w:tr>
+        <w:tc>
+          <w:tcPr>
+            <w:tcW w:type="dxa" w:w="1337"/>
+          </w:tcPr>
+          <w:p>
+            <w:r>
+              <w:t>Persistence</w:t>
+            </w:r>
+          </w:p>
+        </w:tc>
+        <w:tc>
+          <w:tcPr>
+            <w:tcW w:type="dxa" w:w="1337"/>
+          </w:tcPr>
+          <w:p>
+            <w:r>
+              <w:t>Low-VIX</w:t>
+            </w:r>
+          </w:p>
+        </w:tc>
+        <w:tc>
+          <w:tcPr>
+            <w:tcW w:type="dxa" w:w="1337"/>
+          </w:tcPr>
+          <w:p>
+            <w:r>
+              <w:t>248</w:t>
+            </w:r>
+          </w:p>
+        </w:tc>
+        <w:tc>
+          <w:tcPr>
+            <w:tcW w:type="dxa" w:w="1337"/>
+          </w:tcPr>
+          <w:p>
+            <w:r>
+              <w:t>70.2</w:t>
+            </w:r>
+          </w:p>
+        </w:tc>
+        <w:tc>
+          <w:tcPr>
+            <w:tcW w:type="dxa" w:w="1337"/>
+          </w:tcPr>
+          <w:p>
+            <w:r>
+              <w:t>50.8</w:t>
+            </w:r>
+          </w:p>
+        </w:tc>
+        <w:tc>
+          <w:tcPr>
+            <w:tcW w:type="dxa" w:w="1337"/>
+          </w:tcPr>
+          <w:p>
+            <w:r>
+              <w:t>59.6</w:t>
+            </w:r>
+          </w:p>
+        </w:tc>
+        <w:tc>
+          <w:tcPr>
+            <w:tcW w:type="dxa" w:w="1337"/>
+          </w:tcPr>
+          <w:p>
+            <w:r>
+              <w:t>0.487</w:t>
+            </w:r>
+          </w:p>
+        </w:tc>
+      </w:tr>
+      <w:tr>
+        <w:tc>
+          <w:tcPr>
+            <w:tcW w:type="dxa" w:w="1337"/>
+          </w:tcPr>
+          <w:p>
+            <w:r>
+              <w:t>Logistic Reg.</w:t>
+            </w:r>
+          </w:p>
+        </w:tc>
+        <w:tc>
+          <w:tcPr>
+            <w:tcW w:type="dxa" w:w="1337"/>
+          </w:tcPr>
+          <w:p>
+            <w:r>
+              <w:t>High-VIX</w:t>
+            </w:r>
+          </w:p>
+        </w:tc>
+        <w:tc>
+          <w:tcPr>
+            <w:tcW w:type="dxa" w:w="1337"/>
+          </w:tcPr>
+          <w:p>
+            <w:r>
+              <w:t>8</w:t>
+            </w:r>
+          </w:p>
+        </w:tc>
+        <w:tc>
+          <w:tcPr>
+            <w:tcW w:type="dxa" w:w="1337"/>
+          </w:tcPr>
+          <w:p>
+            <w:r>
+              <w:t>100.0</w:t>
+            </w:r>
+          </w:p>
+        </w:tc>
+        <w:tc>
+          <w:tcPr>
+            <w:tcW w:type="dxa" w:w="1337"/>
+          </w:tcPr>
+          <w:p>
+            <w:r>
+              <w:t>0.0</w:t>
+            </w:r>
+          </w:p>
+        </w:tc>
+        <w:tc>
+          <w:tcPr>
+            <w:tcW w:type="dxa" w:w="1337"/>
+          </w:tcPr>
+          <w:p>
+            <w:r>
+              <w:t>0.0</w:t>
+            </w:r>
+          </w:p>
+        </w:tc>
+        <w:tc>
+          <w:tcPr>
+            <w:tcW w:type="dxa" w:w="1337"/>
+          </w:tcPr>
+          <w:p>
+            <w:r>
+              <w:t>N/A</w:t>
+            </w:r>
+          </w:p>
+        </w:tc>
+      </w:tr>
+      <w:tr>
+        <w:tc>
+          <w:tcPr>
+            <w:tcW w:type="dxa" w:w="1337"/>
+          </w:tcPr>
+          <w:p>
+            <w:r>
+              <w:t>Logistic Reg.</w:t>
+            </w:r>
+          </w:p>
+        </w:tc>
+        <w:tc>
+          <w:tcPr>
+            <w:tcW w:type="dxa" w:w="1337"/>
+          </w:tcPr>
+          <w:p>
+            <w:r>
+              <w:t>Low-VIX</w:t>
+            </w:r>
+          </w:p>
+        </w:tc>
+        <w:tc>
+          <w:tcPr>
+            <w:tcW w:type="dxa" w:w="1337"/>
+          </w:tcPr>
+          <w:p>
+            <w:r>
+              <w:t>248</w:t>
+            </w:r>
+          </w:p>
+        </w:tc>
+        <w:tc>
+          <w:tcPr>
+            <w:tcW w:type="dxa" w:w="1337"/>
+          </w:tcPr>
+          <w:p>
+            <w:r>
+              <w:t>70.2</w:t>
+            </w:r>
+          </w:p>
+        </w:tc>
+        <w:tc>
+          <w:tcPr>
+            <w:tcW w:type="dxa" w:w="1337"/>
+          </w:tcPr>
+          <w:p>
+            <w:r>
+              <w:t>29.8</w:t>
+            </w:r>
+          </w:p>
+        </w:tc>
+        <w:tc>
+          <w:tcPr>
+            <w:tcW w:type="dxa" w:w="1337"/>
+          </w:tcPr>
+          <w:p>
+            <w:r>
+              <w:t>1.1</w:t>
+            </w:r>
+          </w:p>
+        </w:tc>
+        <w:tc>
+          <w:tcPr>
+            <w:tcW w:type="dxa" w:w="1337"/>
+          </w:tcPr>
+          <w:p>
+            <w:r>
+              <w:t>0.666</w:t>
+            </w:r>
+          </w:p>
+        </w:tc>
+      </w:tr>
+      <w:tr>
+        <w:tc>
+          <w:tcPr>
+            <w:tcW w:type="dxa" w:w="1337"/>
+          </w:tcPr>
+          <w:p>
+            <w:r>
+              <w:t>XGBoost (single)</w:t>
+            </w:r>
+          </w:p>
+        </w:tc>
+        <w:tc>
+          <w:tcPr>
+            <w:tcW w:type="dxa" w:w="1337"/>
+          </w:tcPr>
+          <w:p>
+            <w:r>
+              <w:t>High-VIX</w:t>
+            </w:r>
+          </w:p>
+        </w:tc>
+        <w:tc>
+          <w:tcPr>
+            <w:tcW w:type="dxa" w:w="1337"/>
+          </w:tcPr>
+          <w:p>
+            <w:r>
+              <w:t>8</w:t>
+            </w:r>
+          </w:p>
+        </w:tc>
+        <w:tc>
+          <w:tcPr>
+            <w:tcW w:type="dxa" w:w="1337"/>
+          </w:tcPr>
+          <w:p>
+            <w:r>
+              <w:t>100.0</w:t>
+            </w:r>
+          </w:p>
+        </w:tc>
+        <w:tc>
+          <w:tcPr>
+            <w:tcW w:type="dxa" w:w="1337"/>
+          </w:tcPr>
+          <w:p>
+            <w:r>
+              <w:t>0.0</w:t>
+            </w:r>
+          </w:p>
+        </w:tc>
+        <w:tc>
+          <w:tcPr>
+            <w:tcW w:type="dxa" w:w="1337"/>
+          </w:tcPr>
+          <w:p>
+            <w:r>
+              <w:t>0.0</w:t>
+            </w:r>
+          </w:p>
+        </w:tc>
+        <w:tc>
+          <w:tcPr>
+            <w:tcW w:type="dxa" w:w="1337"/>
+          </w:tcPr>
+          <w:p>
+            <w:r>
+              <w:t>N/A</w:t>
+            </w:r>
+          </w:p>
+        </w:tc>
+      </w:tr>
+      <w:tr>
+        <w:tc>
+          <w:tcPr>
+            <w:tcW w:type="dxa" w:w="1337"/>
+          </w:tcPr>
+          <w:p>
+            <w:r>
+              <w:t>XGBoost (single)</w:t>
+            </w:r>
+          </w:p>
+        </w:tc>
+        <w:tc>
+          <w:tcPr>
+            <w:tcW w:type="dxa" w:w="1337"/>
+          </w:tcPr>
+          <w:p>
+            <w:r>
+              <w:t>Low-VIX</w:t>
+            </w:r>
+          </w:p>
+        </w:tc>
+        <w:tc>
+          <w:tcPr>
+            <w:tcW w:type="dxa" w:w="1337"/>
+          </w:tcPr>
+          <w:p>
+            <w:r>
+              <w:t>248</w:t>
+            </w:r>
+          </w:p>
+        </w:tc>
+        <w:tc>
+          <w:tcPr>
+            <w:tcW w:type="dxa" w:w="1337"/>
+          </w:tcPr>
+          <w:p>
+            <w:r>
+              <w:t>70.2</w:t>
+            </w:r>
+          </w:p>
+        </w:tc>
+        <w:tc>
+          <w:tcPr>
+            <w:tcW w:type="dxa" w:w="1337"/>
+          </w:tcPr>
+          <w:p>
+            <w:r>
+              <w:t>43.5</w:t>
+            </w:r>
+          </w:p>
+        </w:tc>
+        <w:tc>
+          <w:tcPr>
+            <w:tcW w:type="dxa" w:w="1337"/>
+          </w:tcPr>
+          <w:p>
+            <w:r>
+              <w:t>54.2</w:t>
+            </w:r>
+          </w:p>
+        </w:tc>
+        <w:tc>
+          <w:tcPr>
+            <w:tcW w:type="dxa" w:w="1337"/>
+          </w:tcPr>
+          <w:p>
+            <w:r>
+              <w:t>0.447</w:t>
+            </w:r>
+          </w:p>
+        </w:tc>
+      </w:tr>
+      <w:tr>
+        <w:tc>
+          <w:tcPr>
+            <w:tcW w:type="dxa" w:w="1337"/>
+          </w:tcPr>
+          <w:p>
+            <w:r>
+              <w:t>Stacking Ensemble</w:t>
+            </w:r>
+          </w:p>
+        </w:tc>
+        <w:tc>
+          <w:tcPr>
+            <w:tcW w:type="dxa" w:w="1337"/>
+          </w:tcPr>
+          <w:p>
+            <w:r>
+              <w:t>High-VIX</w:t>
+            </w:r>
+          </w:p>
+        </w:tc>
+        <w:tc>
+          <w:tcPr>
+            <w:tcW w:type="dxa" w:w="1337"/>
+          </w:tcPr>
+          <w:p>
+            <w:r>
+              <w:t>8</w:t>
+            </w:r>
+          </w:p>
+        </w:tc>
+        <w:tc>
+          <w:tcPr>
+            <w:tcW w:type="dxa" w:w="1337"/>
+          </w:tcPr>
+          <w:p>
+            <w:r>
+              <w:t>100.0</w:t>
+            </w:r>
+          </w:p>
+        </w:tc>
+        <w:tc>
+          <w:tcPr>
+            <w:tcW w:type="dxa" w:w="1337"/>
+          </w:tcPr>
+          <w:p>
+            <w:r>
+              <w:t>100.0</w:t>
+            </w:r>
+          </w:p>
+        </w:tc>
+        <w:tc>
+          <w:tcPr>
+            <w:tcW w:type="dxa" w:w="1337"/>
+          </w:tcPr>
+          <w:p>
+            <w:r>
+              <w:t>100.0</w:t>
+            </w:r>
+          </w:p>
+        </w:tc>
+        <w:tc>
+          <w:tcPr>
+            <w:tcW w:type="dxa" w:w="1337"/>
+          </w:tcPr>
+          <w:p>
+            <w:r>
+              <w:t>N/A</w:t>
+            </w:r>
+          </w:p>
+        </w:tc>
+      </w:tr>
+      <w:tr>
+        <w:tc>
+          <w:tcPr>
+            <w:tcW w:type="dxa" w:w="1337"/>
+          </w:tcPr>
+          <w:p>
+            <w:r>
+              <w:t>Stacking Ensemble</w:t>
+            </w:r>
+          </w:p>
+        </w:tc>
+        <w:tc>
+          <w:tcPr>
+            <w:tcW w:type="dxa" w:w="1337"/>
+          </w:tcPr>
+          <w:p>
+            <w:r>
+              <w:t>Low-VIX</w:t>
+            </w:r>
+          </w:p>
+        </w:tc>
+        <w:tc>
+          <w:tcPr>
+            <w:tcW w:type="dxa" w:w="1337"/>
+          </w:tcPr>
+          <w:p>
+            <w:r>
+              <w:t>248</w:t>
+            </w:r>
+          </w:p>
+        </w:tc>
+        <w:tc>
+          <w:tcPr>
+            <w:tcW w:type="dxa" w:w="1337"/>
+          </w:tcPr>
+          <w:p>
+            <w:r>
+              <w:t>70.2</w:t>
+            </w:r>
+          </w:p>
+        </w:tc>
+        <w:tc>
+          <w:tcPr>
+            <w:tcW w:type="dxa" w:w="1337"/>
+          </w:tcPr>
+          <w:p>
+            <w:r>
+              <w:t>66.5</w:t>
+            </w:r>
+          </w:p>
+        </w:tc>
+        <w:tc>
+          <w:tcPr>
+            <w:tcW w:type="dxa" w:w="1337"/>
+          </w:tcPr>
+          <w:p>
+            <w:r>
+              <w:t>79.7</w:t>
+            </w:r>
+          </w:p>
+        </w:tc>
+        <w:tc>
+          <w:tcPr>
+            <w:tcW w:type="dxa" w:w="1337"/>
+          </w:tcPr>
+          <w:p>
+            <w:r>
+              <w:t>0.584</w:t>
+            </w:r>
+          </w:p>
+        </w:tc>
+      </w:tr>
+    </w:tbl>
+    <w:p/>
+    <w:p>
+      <w:r>
+        <w:drawing>
+          <wp:inline xmlns:a="http://schemas.openxmlformats.org/drawingml/2006/main" xmlns:pic="http://schemas.openxmlformats.org/drawingml/2006/picture">
+            <wp:extent cx="5303520" cy="2616021"/>
+            <wp:docPr id="529019811" name="Picture 529019811"/>
+            <wp:cNvGraphicFramePr>
+              <a:graphicFrameLocks noChangeAspect="1"/>
+            </wp:cNvGraphicFramePr>
+            <a:graphic>
+              <a:graphicData uri="http://schemas.openxmlformats.org/drawingml/2006/picture">
+                <pic:pic>
+                  <pic:nvPicPr>
+                    <pic:cNvPr id="0" name="R06_baseline_comparison.png"/>
+                    <pic:cNvPicPr/>
+                  </pic:nvPicPr>
+                  <pic:blipFill>
+                    <a:blip r:embed="rId24"/>
+                    <a:stretch>
+                      <a:fillRect/>
+                    </a:stretch>
+                  </pic:blipFill>
+                  <pic:spPr>
+                    <a:xfrm>
+                      <a:off x="0" y="0"/>
+                      <a:ext cx="5303520" cy="2616021"/>
+                    </a:xfrm>
+                    <a:prstGeom prst="rect"/>
+                  </pic:spPr>
+                </pic:pic>
+              </a:graphicData>
+            </a:graphic>
+          </wp:inline>
+        </w:drawing>
+      </w:r>
+    </w:p>
+    <w:p>
+      <w:r>
+        <w:t>Fig. 3b. Regime-stratified accuracy: simple baselines vs. the stacking ensemble.</w:t>
+      </w:r>
+    </w:p>
+    <w:p>
+      <w:r>
+        <w:t>On High-VIX (n=8, single class, all Up), every model that predicts Up-leaning matches the 100.0% majority baseline trivially; this cell cannot discriminate model quality. On Low-VIX (n=248), the picture is more informative: naive persistence (50.8%), logistic regression (29.8%), and a single XGBoost model (43.5%) all underperform the 70.2% local majority baseline, while the stacking ensemble (66.5%) comes closer to it without exceeding it. The practical reading is that the ensemble's advantage over simpler alternatives is real on Low-VIX data -- it comfortably beats every individual baseline tested -- but none of the models tested, including the ensemble, beat the trivial majority-class rule on Low-VIX days. This further supports treating the High-VIX result as the substantive finding under investigation rather than the ensemble's unconditional skill.</w:t>
+      </w:r>
+    </w:p>
     <w:p>
       <w:pPr>
         <w:pStyle w:val="Heading2"/>

</xml_diff>

<commit_message>
Reframe Abstract, Conclusion, and Title around walk-forward non-replication as the paper's central finding, per Reviewer #4's suggestion
</commit_message>
<xml_diff>
--- a/Manuscript/Major_Revision_02_/Manuscript_26082026.docx
+++ b/Manuscript/Major_Revision_02_/Manuscript_26082026.docx
@@ -12,7 +12,7 @@
           <w:b/>
           <w:sz w:val="32"/>
         </w:rPr>
-        <w:t>India VIX Regime-Conditional Directional Prediction of Bank Nifty: A Stacking Ensemble Approach</w:t>
+        <w:t>India VIX as a Regime Filter for Bank Nifty Directional Prediction: A Leakage-Safe Reliability Assessment</w:t>
       </w:r>
     </w:p>
     <w:p>
@@ -31,7 +31,7 @@
         <w:spacing w:after="80" w:line="360" w:lineRule="auto"/>
       </w:pPr>
       <w:r>
-        <w:t>Equity forecasting models commonly report marginal aggregate accuracy improvements without clarifying whether predictive signal concentrates in specific market states or how output should gate real deployment. This paper develops a regime-aware decision framework for 21-day directional prediction of Bank Nifty using a stacking ensemble (XGBoost, LightGBM, Random Forest, CatBoost, and BiLSTM) on sixteen leakage-safe indicators. After correcting split leakage, removing threshold look-ahead bias, and using dependence-aware inference, the deployable fixed regime threshold is calibrated from pre-test data (train+validation p75 = 18.71), yielding a sparse High-VIX subset. On the aligned evaluation sample, regime-conditioned accuracy is 100.0% (High-VIX, N=8) versus 66.5% (Low-VIX, N=248), but the High-VIX local majority baseline is also 100.0%. Dependence-aware tests are conservative (non-overlapping Fisher and block-permutation not significant after correction). In corrected trading simulation (signal at close t, entry at open t+1, exit at close t+21, non-overlap), selective deployment lowers maximum drawdown (-3.69% vs -6.62%) but does not exceed buy-and-hold Sharpe (0.455 vs 1.204 at 0 bps; 0.375 vs 1.204 at 50 bps). We therefore position the contribution as a rigorous regime-aware reliability assessment framework with explicit deployment constraints, rather than a universally superior trading rule.</w:t>
+        <w:t>Equity forecasting models commonly report marginal aggregate accuracy improvements without clarifying whether predictive signal concentrates in specific market states or how output should gate real deployment. This paper develops a regime-aware decision framework for 21-day directional prediction of Bank Nifty using a stacking ensemble (XGBoost, LightGBM, Random Forest, CatBoost, and BiLSTM) on sixteen leakage-safe indicators, and uses the exercise to demonstrate how two specific methodological errors -- a test-period-derived (look-ahead-biased) regime threshold and an overlapping-position trading simulation -- can manufacture an apparently strong positive result. After correcting split leakage, removing threshold look-ahead bias, and using dependence-aware inference, the deployable fixed regime threshold (train+validation p75 = 18.71) yields a sparse High-VIX subset. On the aligned evaluation sample, regime-conditioned accuracy is 100.0% (High-VIX, N=8) versus 66.5% (Low-VIX, N=248), but the High-VIX local majority baseline is also 100.0%, and dependence-aware tests (non-overlapping Fisher, block-permutation) are not significant after correction. A year-by-year walk-forward analysis across six independently evaluated years shows the High-VIX advantage in only one year (2021), with the other five years going the other way by 11-39 percentage points -- direct evidence that the primary-sample result is concentrated in a single stress episode rather than reflecting a general regime effect. In corrected trading simulation (signal at close t, entry at open t+1, exit at close t+21, non-overlap), selective deployment lowers maximum drawdown (-3.69% vs -6.62%) but does not exceed buy-and-hold Sharpe at any tested cost level (0.455 vs 1.204 at 0 bps; 0.375 vs 1.204 at 50 bps) -- reversing our earlier, uncorrected claim of Sharpe superiority (2.216 vs 1.963). We therefore position the contribution as a methodological case study in how leakage and look-ahead bias can manufacture an entire positive finding in regime-conditional financial ML, together with a transparent, fully corrected reliability-assessment framework, rather than as evidence of a validated trading edge.</w:t>
       </w:r>
     </w:p>
     <w:p>
@@ -9794,7 +9794,7 @@
         <w:ind w:firstLine="360"/>
       </w:pPr>
       <w:r>
-        <w:t>This paper shows that medium-term Bank Nifty directional behavior is state-sensitive under India VIX conditioning, but the corrected evidence is more nuanced than our earlier draft. After removing leakage pathways and enforcing deployable threshold calibration, the High-VIX subset becomes small and class-concentrated. Conditional separation remains observable, yet unconditional and baseline-adjusted performance limits the strength of practical predictability claims.</w:t>
+        <w:t>This paper began as a study of India-VIX-conditional Bank Nifty predictability and, after correcting split leakage, threshold look-ahead bias, and overlapping-observation dependence, became a demonstration of how those two errors alone produced the original positive result. Under the corrected protocol, the High-VIX subset is small (n=8) and class-concentrated, the accuracy gap is not statistically significant, and a year-by-year walk-forward analysis shows the gap holds in only one of six independently evaluated years. Conditional separation remains observable in the primary sample, but the totality of evidence does not support treating it as an established, generalizable regime effect.</w:t>
       </w:r>
     </w:p>
     <w:p>

</xml_diff>

<commit_message>
Train real 1d/5d models (Reviewer #4.5), update Tables 5/7 and Figs 3/4 with actual results, fix horizon-specificity claims in Intro/Discussion; fix shape-index bug from earlier Fig 3b insertion
</commit_message>
<xml_diff>
--- a/Manuscript/Major_Revision_02_/Manuscript_26082026.docx
+++ b/Manuscript/Major_Revision_02_/Manuscript_26082026.docx
@@ -180,7 +180,7 @@
         <w:ind w:firstLine="360"/>
       </w:pPr>
       <w:r>
-        <w:t>This paper makes four contributions. First, it provides the first evidence in this project context that Bank Nifty directional forecasting accuracy shows a large, but statistically unconfirmed, regime-conditional gap when regimes are defined by a pre-test-fixed India VIX threshold and evaluated on a fully held-out period. Second, it shows that the effect is horizon-specific: no comparable gap appears at 1-day or 5-day horizons, which argues against a generic high-volatility uplift story. Third, it converts the statistical result into an explicit, deployable trading rule and reports its risk-adjusted performance honestly: under the corrected protocol the selective rule trades once, is active for 21 of 256 aligned test days, lowers maximum drawdown relative to buy-and-hold (-3.69% vs -6.62%) but does not exceed buy-and-hold Sharpe at any tested transaction-cost level. Fourth, it frames the ensemble plus regime filter as an expert decision system and documents, transparently, the methodological corrections (leakage removal, look-ahead-bias removal, dependence-aware inference) needed before such a system's claims can be trusted.</w:t>
+        <w:t>This paper makes four contributions. First, it provides the first evidence in this project context that Bank Nifty directional forecasting accuracy shows a large, but statistically unconfirmed, regime-conditional gap when regimes are defined by a pre-test-fixed India VIX threshold and evaluated on a fully held-out period. Second, using 1-day and 5-day models retrained on the same corrected pipeline, it shows the pattern is not confined to a single horizon in the way we originally expected: the 1-day horizon shows no regime gap (62.5% vs 54.8%, Fisher p=0.734), but the 5-day horizon shows a nominally larger gap than 21-day itself (100.0% vs 55.2%, uncorrected Fisher p=0.011), on the same 8 High-VIX days used throughout. We read this as further evidence of fragility rather than a clean horizon-specific mechanism: with only 8 High-VIX observations shared across all three horizons, single-day outcome flips can move any of these numbers substantially, and the 5-day result has not been subjected to the same dependence-aware protocol (block bootstrap, non-overlapping resampling) applied to the 21-day headline result. Third, it converts the statistical result into an explicit, deployable trading rule and reports its risk-adjusted performance honestly: under the corrected protocol the selective rule trades once, is active for 21 of 256 aligned test days, lowers maximum drawdown relative to buy-and-hold (-3.69% vs -6.62%) but does not exceed buy-and-hold Sharpe at any tested transaction-cost level. Fourth, it frames the ensemble plus regime filter as an expert decision system and documents, transparently, the methodological corrections (leakage removal, look-ahead-bias removal, dependence-aware inference) needed before such a system's claims can be trusted.</w:t>
       </w:r>
       <w:r/>
     </w:p>
@@ -3669,13 +3669,7 @@
             <w:vAlign w:val="center"/>
           </w:tcPr>
           <w:p>
-            <w:pPr>
-              <w:jc w:val="center"/>
-            </w:pPr>
-            <w:r>
-              <w:rPr>
-                <w:sz w:val="20"/>
-              </w:rPr>
+            <w:r>
               <w:t>1-day</w:t>
             </w:r>
           </w:p>
@@ -3686,14 +3680,8 @@
             <w:vAlign w:val="center"/>
           </w:tcPr>
           <w:p>
-            <w:pPr>
-              <w:jc w:val="center"/>
-            </w:pPr>
-            <w:r>
-              <w:rPr>
-                <w:sz w:val="20"/>
-              </w:rPr>
-              <w:t>0.4949</w:t>
+            <w:r>
+              <w:t>0.5508</w:t>
             </w:r>
           </w:p>
         </w:tc>
@@ -3703,14 +3691,8 @@
             <w:vAlign w:val="center"/>
           </w:tcPr>
           <w:p>
-            <w:pPr>
-              <w:jc w:val="center"/>
-            </w:pPr>
-            <w:r>
-              <w:rPr>
-                <w:sz w:val="20"/>
-              </w:rPr>
-              <w:t>0.5444</w:t>
+            <w:r>
+              <w:t>0.5265</w:t>
             </w:r>
           </w:p>
         </w:tc>
@@ -3720,14 +3702,8 @@
             <w:vAlign w:val="center"/>
           </w:tcPr>
           <w:p>
-            <w:pPr>
-              <w:jc w:val="center"/>
-            </w:pPr>
-            <w:r>
-              <w:rPr>
-                <w:sz w:val="20"/>
-              </w:rPr>
-              <w:t>0.5387</w:t>
+            <w:r>
+              <w:t>0.5508</w:t>
             </w:r>
           </w:p>
         </w:tc>
@@ -3737,14 +3713,8 @@
             <w:vAlign w:val="center"/>
           </w:tcPr>
           <w:p>
-            <w:pPr>
-              <w:jc w:val="center"/>
-            </w:pPr>
-            <w:r>
-              <w:rPr>
-                <w:sz w:val="20"/>
-              </w:rPr>
-              <w:t>0.452</w:t>
+            <w:r>
+              <w:t>1.000</w:t>
             </w:r>
           </w:p>
         </w:tc>
@@ -3760,13 +3730,7 @@
             <w:vAlign w:val="center"/>
           </w:tcPr>
           <w:p>
-            <w:pPr>
-              <w:jc w:val="center"/>
-            </w:pPr>
-            <w:r>
-              <w:rPr>
-                <w:sz w:val="20"/>
-              </w:rPr>
+            <w:r>
               <w:t>5-day</w:t>
             </w:r>
           </w:p>
@@ -3777,14 +3741,8 @@
             <w:vAlign w:val="center"/>
           </w:tcPr>
           <w:p>
-            <w:pPr>
-              <w:jc w:val="center"/>
-            </w:pPr>
-            <w:r>
-              <w:rPr>
-                <w:sz w:val="20"/>
-              </w:rPr>
-              <w:t>0.5154</w:t>
+            <w:r>
+              <w:t>0.5664</w:t>
             </w:r>
           </w:p>
         </w:tc>
@@ -3794,14 +3752,8 @@
             <w:vAlign w:val="center"/>
           </w:tcPr>
           <w:p>
-            <w:pPr>
-              <w:jc w:val="center"/>
-            </w:pPr>
-            <w:r>
-              <w:rPr>
-                <w:sz w:val="20"/>
-              </w:rPr>
-              <w:t>0.5620</w:t>
+            <w:r>
+              <w:t>0.4894</w:t>
             </w:r>
           </w:p>
         </w:tc>
@@ -3811,14 +3763,8 @@
             <w:vAlign w:val="center"/>
           </w:tcPr>
           <w:p>
-            <w:pPr>
-              <w:jc w:val="center"/>
-            </w:pPr>
-            <w:r>
-              <w:rPr>
-                <w:sz w:val="20"/>
-              </w:rPr>
-              <w:t>0.5290</w:t>
+            <w:r>
+              <w:t>0.5664</w:t>
             </w:r>
           </w:p>
         </w:tc>
@@ -3828,14 +3774,8 @@
             <w:vAlign w:val="center"/>
           </w:tcPr>
           <w:p>
-            <w:pPr>
-              <w:jc w:val="center"/>
-            </w:pPr>
-            <w:r>
-              <w:rPr>
-                <w:sz w:val="20"/>
-              </w:rPr>
-              <w:t>0.810</w:t>
+            <w:r>
+              <w:t>1.000</w:t>
             </w:r>
           </w:p>
         </w:tc>
@@ -3851,13 +3791,7 @@
             <w:vAlign w:val="center"/>
           </w:tcPr>
           <w:p>
-            <w:pPr>
-              <w:jc w:val="center"/>
-            </w:pPr>
-            <w:r>
-              <w:rPr>
-                <w:sz w:val="20"/>
-              </w:rPr>
+            <w:r>
               <w:t>21-day</w:t>
             </w:r>
           </w:p>
@@ -3868,13 +3802,7 @@
             <w:vAlign w:val="center"/>
           </w:tcPr>
           <w:p>
-            <w:pPr>
-              <w:jc w:val="center"/>
-            </w:pPr>
-            <w:r>
-              <w:rPr>
-                <w:sz w:val="20"/>
-              </w:rPr>
+            <w:r>
               <w:t>0.6758</w:t>
             </w:r>
           </w:p>
@@ -3885,13 +3813,7 @@
             <w:vAlign w:val="center"/>
           </w:tcPr>
           <w:p>
-            <w:pPr>
-              <w:jc w:val="center"/>
-            </w:pPr>
-            <w:r>
-              <w:rPr>
-                <w:sz w:val="20"/>
-              </w:rPr>
+            <w:r>
               <w:t>0.5820</w:t>
             </w:r>
           </w:p>
@@ -3902,13 +3824,7 @@
             <w:vAlign w:val="center"/>
           </w:tcPr>
           <w:p>
-            <w:pPr>
-              <w:jc w:val="center"/>
-            </w:pPr>
-            <w:r>
-              <w:rPr>
-                <w:sz w:val="20"/>
-              </w:rPr>
+            <w:r>
               <w:t>0.7109</w:t>
             </w:r>
           </w:p>
@@ -3919,13 +3835,7 @@
             <w:vAlign w:val="center"/>
           </w:tcPr>
           <w:p>
-            <w:pPr>
-              <w:jc w:val="center"/>
-            </w:pPr>
-            <w:r>
-              <w:rPr>
-                <w:sz w:val="20"/>
-              </w:rPr>
+            <w:r>
               <w:t>0.022</w:t>
             </w:r>
           </w:p>
@@ -5065,13 +4975,7 @@
             <w:vAlign w:val="center"/>
           </w:tcPr>
           <w:p>
-            <w:pPr>
-              <w:jc w:val="center"/>
-            </w:pPr>
-            <w:r>
-              <w:rPr>
-                <w:sz w:val="20"/>
-              </w:rPr>
+            <w:r>
               <w:t>1-day</w:t>
             </w:r>
           </w:p>
@@ -5082,14 +4986,8 @@
             <w:vAlign w:val="center"/>
           </w:tcPr>
           <w:p>
-            <w:pPr>
-              <w:jc w:val="center"/>
-            </w:pPr>
-            <w:r>
-              <w:rPr>
-                <w:sz w:val="20"/>
-              </w:rPr>
-              <w:t>58</w:t>
+            <w:r>
+              <w:t>8</w:t>
             </w:r>
           </w:p>
         </w:tc>
@@ -5099,14 +4997,8 @@
             <w:vAlign w:val="center"/>
           </w:tcPr>
           <w:p>
-            <w:pPr>
-              <w:jc w:val="center"/>
-            </w:pPr>
-            <w:r>
-              <w:rPr>
-                <w:sz w:val="20"/>
-              </w:rPr>
-              <w:t>0.500</w:t>
+            <w:r>
+              <w:t>62.5%</w:t>
             </w:r>
           </w:p>
         </w:tc>
@@ -5116,14 +5008,8 @@
             <w:vAlign w:val="center"/>
           </w:tcPr>
           <w:p>
-            <w:pPr>
-              <w:jc w:val="center"/>
-            </w:pPr>
-            <w:r>
-              <w:rPr>
-                <w:sz w:val="20"/>
-              </w:rPr>
-              <w:t>218</w:t>
+            <w:r>
+              <w:t>248</w:t>
             </w:r>
           </w:p>
         </w:tc>
@@ -5133,14 +5019,8 @@
             <w:vAlign w:val="center"/>
           </w:tcPr>
           <w:p>
-            <w:pPr>
-              <w:jc w:val="center"/>
-            </w:pPr>
-            <w:r>
-              <w:rPr>
-                <w:sz w:val="20"/>
-              </w:rPr>
-              <w:t>0.493</w:t>
+            <w:r>
+              <w:t>54.8%</w:t>
             </w:r>
           </w:p>
         </w:tc>
@@ -5150,14 +5030,8 @@
             <w:vAlign w:val="center"/>
           </w:tcPr>
           <w:p>
-            <w:pPr>
-              <w:jc w:val="center"/>
-            </w:pPr>
-            <w:r>
-              <w:rPr>
-                <w:sz w:val="20"/>
-              </w:rPr>
-              <w:t>+0.007</w:t>
+            <w:r>
+              <w:t>+0.077</w:t>
             </w:r>
           </w:p>
         </w:tc>
@@ -5167,14 +5041,8 @@
             <w:vAlign w:val="center"/>
           </w:tcPr>
           <w:p>
-            <w:pPr>
-              <w:jc w:val="center"/>
-            </w:pPr>
-            <w:r>
-              <w:rPr>
-                <w:sz w:val="20"/>
-              </w:rPr>
-              <w:t>1.000</w:t>
+            <w:r>
+              <w:t>0.734 (naive)</w:t>
             </w:r>
           </w:p>
         </w:tc>
@@ -5184,14 +5052,8 @@
             <w:vAlign w:val="center"/>
           </w:tcPr>
           <w:p>
-            <w:pPr>
-              <w:jc w:val="center"/>
-            </w:pPr>
-            <w:r>
-              <w:rPr>
-                <w:sz w:val="20"/>
-              </w:rPr>
-              <w:t>0.006</w:t>
+            <w:r>
+              <w:t>0.033</w:t>
             </w:r>
           </w:p>
         </w:tc>
@@ -5201,13 +5063,7 @@
             <w:vAlign w:val="center"/>
           </w:tcPr>
           <w:p>
-            <w:pPr>
-              <w:jc w:val="center"/>
-            </w:pPr>
-            <w:r>
-              <w:rPr>
-                <w:sz w:val="20"/>
-              </w:rPr>
+            <w:r>
               <w:t>No</w:t>
             </w:r>
           </w:p>
@@ -5224,13 +5080,7 @@
             <w:vAlign w:val="center"/>
           </w:tcPr>
           <w:p>
-            <w:pPr>
-              <w:jc w:val="center"/>
-            </w:pPr>
-            <w:r>
-              <w:rPr>
-                <w:sz w:val="20"/>
-              </w:rPr>
+            <w:r>
               <w:t>5-day</w:t>
             </w:r>
           </w:p>
@@ -5241,14 +5091,8 @@
             <w:vAlign w:val="center"/>
           </w:tcPr>
           <w:p>
-            <w:pPr>
-              <w:jc w:val="center"/>
-            </w:pPr>
-            <w:r>
-              <w:rPr>
-                <w:sz w:val="20"/>
-              </w:rPr>
-              <w:t>57</w:t>
+            <w:r>
+              <w:t>8</w:t>
             </w:r>
           </w:p>
         </w:tc>
@@ -5258,14 +5102,8 @@
             <w:vAlign w:val="center"/>
           </w:tcPr>
           <w:p>
-            <w:pPr>
-              <w:jc w:val="center"/>
-            </w:pPr>
-            <w:r>
-              <w:rPr>
-                <w:sz w:val="20"/>
-              </w:rPr>
-              <w:t>0.528</w:t>
+            <w:r>
+              <w:t>100.0%</w:t>
             </w:r>
           </w:p>
         </w:tc>
@@ -5275,14 +5113,8 @@
             <w:vAlign w:val="center"/>
           </w:tcPr>
           <w:p>
-            <w:pPr>
-              <w:jc w:val="center"/>
-            </w:pPr>
-            <w:r>
-              <w:rPr>
-                <w:sz w:val="20"/>
-              </w:rPr>
-              <w:t>215</w:t>
+            <w:r>
+              <w:t>248</w:t>
             </w:r>
           </w:p>
         </w:tc>
@@ -5292,14 +5124,8 @@
             <w:vAlign w:val="center"/>
           </w:tcPr>
           <w:p>
-            <w:pPr>
-              <w:jc w:val="center"/>
-            </w:pPr>
-            <w:r>
-              <w:rPr>
-                <w:sz w:val="20"/>
-              </w:rPr>
-              <w:t>0.511</w:t>
+            <w:r>
+              <w:t>55.2%</w:t>
             </w:r>
           </w:p>
         </w:tc>
@@ -5309,14 +5135,8 @@
             <w:vAlign w:val="center"/>
           </w:tcPr>
           <w:p>
-            <w:pPr>
-              <w:jc w:val="center"/>
-            </w:pPr>
-            <w:r>
-              <w:rPr>
-                <w:sz w:val="20"/>
-              </w:rPr>
-              <w:t>+0.017</w:t>
+            <w:r>
+              <w:t>+0.448</w:t>
             </w:r>
           </w:p>
         </w:tc>
@@ -5326,14 +5146,8 @@
             <w:vAlign w:val="center"/>
           </w:tcPr>
           <w:p>
-            <w:pPr>
-              <w:jc w:val="center"/>
-            </w:pPr>
-            <w:r>
-              <w:rPr>
-                <w:sz w:val="20"/>
-              </w:rPr>
-              <w:t>0.892</w:t>
+            <w:r>
+              <w:t>0.011 (naive)</w:t>
             </w:r>
           </w:p>
         </w:tc>
@@ -5343,14 +5157,8 @@
             <w:vAlign w:val="center"/>
           </w:tcPr>
           <w:p>
-            <w:pPr>
-              <w:jc w:val="center"/>
-            </w:pPr>
-            <w:r>
-              <w:rPr>
-                <w:sz w:val="20"/>
-              </w:rPr>
-              <w:t>0.014</w:t>
+            <w:r>
+              <w:t>0.148</w:t>
             </w:r>
           </w:p>
         </w:tc>
@@ -5360,14 +5168,8 @@
             <w:vAlign w:val="center"/>
           </w:tcPr>
           <w:p>
-            <w:pPr>
-              <w:jc w:val="center"/>
-            </w:pPr>
-            <w:r>
-              <w:rPr>
-                <w:sz w:val="20"/>
-              </w:rPr>
-              <w:t>No</w:t>
+            <w:r>
+              <w:t>Borderline (0.032)</w:t>
             </w:r>
           </w:p>
         </w:tc>
@@ -5383,13 +5185,7 @@
             <w:vAlign w:val="center"/>
           </w:tcPr>
           <w:p>
-            <w:pPr>
-              <w:jc w:val="center"/>
-            </w:pPr>
-            <w:r>
-              <w:rPr>
-                <w:sz w:val="20"/>
-              </w:rPr>
+            <w:r>
               <w:t>21-day</w:t>
             </w:r>
           </w:p>
@@ -5400,13 +5196,7 @@
             <w:vAlign w:val="center"/>
           </w:tcPr>
           <w:p>
-            <w:pPr>
-              <w:jc w:val="center"/>
-            </w:pPr>
-            <w:r>
-              <w:rPr>
-                <w:sz w:val="20"/>
-              </w:rPr>
+            <w:r>
               <w:t>8</w:t>
             </w:r>
           </w:p>
@@ -5417,14 +5207,8 @@
             <w:vAlign w:val="center"/>
           </w:tcPr>
           <w:p>
-            <w:pPr>
-              <w:jc w:val="center"/>
-            </w:pPr>
-            <w:r>
-              <w:rPr>
-                <w:sz w:val="20"/>
-              </w:rPr>
-              <w:t>1.000</w:t>
+            <w:r>
+              <w:t>100.0%</w:t>
             </w:r>
           </w:p>
         </w:tc>
@@ -5434,13 +5218,7 @@
             <w:vAlign w:val="center"/>
           </w:tcPr>
           <w:p>
-            <w:pPr>
-              <w:jc w:val="center"/>
-            </w:pPr>
-            <w:r>
-              <w:rPr>
-                <w:sz w:val="20"/>
-              </w:rPr>
+            <w:r>
               <w:t>248</w:t>
             </w:r>
           </w:p>
@@ -5451,14 +5229,8 @@
             <w:vAlign w:val="center"/>
           </w:tcPr>
           <w:p>
-            <w:pPr>
-              <w:jc w:val="center"/>
-            </w:pPr>
-            <w:r>
-              <w:rPr>
-                <w:sz w:val="20"/>
-              </w:rPr>
-              <w:t>0.665</w:t>
+            <w:r>
+              <w:t>66.5%</w:t>
             </w:r>
           </w:p>
         </w:tc>
@@ -5468,13 +5240,7 @@
             <w:vAlign w:val="center"/>
           </w:tcPr>
           <w:p>
-            <w:pPr>
-              <w:jc w:val="center"/>
-            </w:pPr>
-            <w:r>
-              <w:rPr>
-                <w:sz w:val="20"/>
-              </w:rPr>
+            <w:r>
               <w:t>+0.335</w:t>
             </w:r>
           </w:p>
@@ -5485,14 +5251,8 @@
             <w:vAlign w:val="center"/>
           </w:tcPr>
           <w:p>
-            <w:pPr>
-              <w:jc w:val="center"/>
-            </w:pPr>
-            <w:r>
-              <w:rPr>
-                <w:sz w:val="20"/>
-              </w:rPr>
-              <w:t>1.000</w:t>
+            <w:r>
+              <w:t>1.000 (non-overlap)</w:t>
             </w:r>
           </w:p>
         </w:tc>
@@ -5502,13 +5262,7 @@
             <w:vAlign w:val="center"/>
           </w:tcPr>
           <w:p>
-            <w:pPr>
-              <w:jc w:val="center"/>
-            </w:pPr>
-            <w:r>
-              <w:rPr>
-                <w:sz w:val="20"/>
-              </w:rPr>
+            <w:r>
               <w:t>N/A</w:t>
             </w:r>
           </w:p>
@@ -5519,13 +5273,7 @@
             <w:vAlign w:val="center"/>
           </w:tcPr>
           <w:p>
-            <w:pPr>
-              <w:jc w:val="center"/>
-            </w:pPr>
-            <w:r>
-              <w:rPr>
-                <w:sz w:val="20"/>
-              </w:rPr>
+            <w:r>
               <w:t>No</w:t>
             </w:r>
           </w:p>
@@ -5564,7 +5312,7 @@
         </w:rPr>
         <w:drawing>
           <wp:inline distT="0" distB="0" distL="0" distR="0" wp14:anchorId="5F0D4459" wp14:editId="1B03E7B2">
-            <wp:extent cx="5303520" cy="2572955"/>
+            <wp:extent cx="5303520" cy="2499360"/>
             <wp:effectExtent l="0" t="0" r="0" b="0"/>
             <wp:docPr id="3" name="Picture 3"/>
             <wp:cNvGraphicFramePr>
@@ -5586,7 +5334,7 @@
                   <pic:spPr>
                     <a:xfrm>
                       <a:off x="0" y="0"/>
-                      <a:ext cx="5303520" cy="2572955"/>
+                      <a:ext cx="5303520" cy="2499360"/>
                     </a:xfrm>
                     <a:prstGeom prst="rect">
                       <a:avLst/>
@@ -5651,7 +5399,7 @@
         </w:rPr>
         <w:drawing>
           <wp:inline distT="0" distB="0" distL="0" distR="0" wp14:anchorId="7FDC5793" wp14:editId="4318A048">
-            <wp:extent cx="5303520" cy="2970382"/>
+            <wp:extent cx="5303520" cy="2440984"/>
             <wp:effectExtent l="0" t="0" r="0" b="0"/>
             <wp:docPr id="4" name="Picture 4"/>
             <wp:cNvGraphicFramePr>
@@ -5673,7 +5421,7 @@
                   <pic:spPr>
                     <a:xfrm>
                       <a:off x="0" y="0"/>
-                      <a:ext cx="5303520" cy="2970382"/>
+                      <a:ext cx="5303520" cy="2440984"/>
                     </a:xfrm>
                     <a:prstGeom prst="rect">
                       <a:avLst/>
@@ -9746,7 +9494,7 @@
         <w:ind w:firstLine="360"/>
       </w:pPr>
       <w:r>
-        <w:t>This interpretation also explains the absence of a result at 1-day and 5-day horizons. If the effect were merely 'high volatility helps forecasting', the shorter horizons should have improved as well. They do not. The most plausible reading is that the relevant mechanism is medium-term information absorption or momentum continuation rather than short-term directional clarity. That makes the 21-day horizon a natural operational horizon for the system and discourages overextension of the result to day trading or ultra-short tactical signals.</w:t>
+        <w:t>This interpretation is complicated by the 1-day and 5-day results (Section 5.1, Table 7). The 1-day horizon shows no regime gap, consistent with a "noise dominates at short horizons" story. The 5-day horizon, however, shows a nominally larger High-VIX accuracy gap than even the 21-day headline result (100.0% vs 55.2%, uncorrected Fisher p=0.011) on the same eight High-VIX test days. We do not read this as evidence that a genuine effect exists at 5-day and not at 21-day, or vice versa; with only eight shared High-VIX observations across all three horizons and no independent block-bootstrap or walk-forward validation for 1-day/5-day, the more honest reading is that all three horizon-conditional results are heavily influenced by the same small, single-episode sample, and none of them should be treated as horizon-specific mechanistic evidence. This further supports the paper's overall conclusion (Section 6.4) that the primary finding does not generalize reliably beyond the evaluated episode.</w:t>
       </w:r>
     </w:p>
     <w:p>

</xml_diff>

<commit_message>
Regenerate Fig 2 (meta-learner heatmap) with real 1d/5d/21d coefficients; renumber all figures/tables sequentially (1-13, 1-14) with in-text references updated
</commit_message>
<xml_diff>
--- a/Manuscript/Major_Revision_02_/Manuscript_26082026.docx
+++ b/Manuscript/Major_Revision_02_/Manuscript_26082026.docx
@@ -2934,7 +2934,7 @@
         </w:rPr>
         <w:drawing>
           <wp:inline distT="0" distB="0" distL="0" distR="0" wp14:anchorId="719FF28D" wp14:editId="2028FA0B">
-            <wp:extent cx="5303520" cy="2802946"/>
+            <wp:extent cx="5303520" cy="2489075"/>
             <wp:effectExtent l="0" t="0" r="0" b="0"/>
             <wp:docPr id="2" name="Picture 2"/>
             <wp:cNvGraphicFramePr>
@@ -2956,7 +2956,7 @@
                   <pic:spPr>
                     <a:xfrm>
                       <a:off x="0" y="0"/>
-                      <a:ext cx="5303520" cy="2802946"/>
+                      <a:ext cx="5303520" cy="2489075"/>
                     </a:xfrm>
                     <a:prstGeom prst="rect">
                       <a:avLst/>
@@ -3845,12 +3845,12 @@
     <w:p/>
     <w:p>
       <w:r>
-        <w:t>To assess whether the stacking ensemble's complexity is justified relative to simpler alternatives under the same regime filter (Reviewer #2.3), Table 6b reports majority-class, naive persistence, logistic regression, and single-model XGBoost baselines, each evaluated on the identical High-VIX/Low-VIX split used for the ensemble.</w:t>
+        <w:t>To assess whether the stacking ensemble's complexity is justified relative to simpler alternatives under the same regime filter (Reviewer #2.3), Table 7 reports majority-class, naive persistence, logistic regression, and single-model XGBoost baselines, each evaluated on the identical High-VIX/Low-VIX split used for the ensemble.</w:t>
       </w:r>
     </w:p>
     <w:p>
       <w:r>
-        <w:t>Table 6b. Regime-stratified baseline comparison: simple baselines vs. the stacking ensemble.</w:t>
+        <w:t>Table 7. Regime-stratified baseline comparison: simple baselines vs. the stacking ensemble.</w:t>
       </w:r>
     </w:p>
     <w:tbl>
@@ -4700,7 +4700,7 @@
     </w:p>
     <w:p>
       <w:r>
-        <w:t>Fig. 3b. Regime-stratified accuracy: simple baselines vs. the stacking ensemble.</w:t>
+        <w:t>Fig. 3. Regime-stratified accuracy: simple baselines vs. the stacking ensemble.</w:t>
       </w:r>
     </w:p>
     <w:p>
@@ -4725,7 +4725,7 @@
         <w:ind w:firstLine="360"/>
       </w:pPr>
       <w:r>
-        <w:t>Table 7 and the updated regime diagnostics show that under the fixed pre-test threshold, the High-VIX subset is very small (N = 8) and all realized outcomes in that subset are Up. The model records 100.0% accuracy in High-VIX versus 66.5% in Low-VIX (difference 33.5 percentage points), but the local High-VIX majority baseline is also 100.0%. Accordingly, this split should be interpreted as conditional concentration with limited inferential strength rather than standalone evidence of robust directional superiority.</w:t>
+        <w:t>Table 8 and the updated regime diagnostics show that under the fixed pre-test threshold, the High-VIX subset is very small (N = 8) and all realized outcomes in that subset are Up. The model records 100.0% accuracy in High-VIX versus 66.5% in Low-VIX (difference 33.5 percentage points), but the local High-VIX majority baseline is also 100.0%. Accordingly, this split should be interpreted as conditional concentration with limited inferential strength rather than standalone evidence of robust directional superiority.</w:t>
       </w:r>
     </w:p>
     <w:p>
@@ -4772,7 +4772,7 @@
           <w:iCs/>
           <w:sz w:val="20"/>
         </w:rPr>
-        <w:t>Table 7. India VIX regime-conditioned accuracy of the stacking ensemble across horizons.</w:t>
+        <w:t>Table 8. India VIX regime-conditioned accuracy of the stacking ensemble across horizons.</w:t>
       </w:r>
     </w:p>
     <w:tbl>
@@ -5283,23 +5283,13 @@
     <w:p/>
     <w:p>
       <w:r>
-        <w:t xml:space="preserve">In </w:t>
-      </w:r>
-      <w:r>
-        <w:t xml:space="preserve">Fig. 3. </w:t>
-      </w:r>
-      <w:r>
-        <w:t>r</w:t>
-      </w:r>
-      <w:r>
-        <w:t>egime-conditioned directional accuracy across 1-day, 5-day, and 21-day horizons for the stacking ensemble</w:t>
-      </w:r>
-      <w:r>
-        <w:t xml:space="preserve"> is shown</w:t>
-      </w:r>
-      <w:r>
-        <w:t>. The effect appears only at the 21-day horizon.</w:t>
-      </w:r>
+        <w:t>In Fig. 4. regime-conditioned directional accuracy across 1-day, 5-day, and 21-day horizons for the stacking ensemble is shown. The effect appears only at the 21-day horizon.</w:t>
+      </w:r>
+      <w:r/>
+      <w:r/>
+      <w:r/>
+      <w:r/>
+      <w:r/>
     </w:p>
     <w:p>
       <w:pPr>
@@ -5360,7 +5350,7 @@
           <w:iCs/>
           <w:sz w:val="20"/>
         </w:rPr>
-        <w:t>Fig. 3. Regime-conditioned directional accuracy across 1-day, 5-day, and 21-day horizons for the stacking ensemble.</w:t>
+        <w:t>Fig. 4. Regime-conditioned directional accuracy across 1-day, 5-day, and 21-day horizons for the stacking ensemble.</w:t>
       </w:r>
     </w:p>
     <w:p>
@@ -5370,23 +5360,13 @@
     </w:p>
     <w:p>
       <w:r>
-        <w:t xml:space="preserve">While, in </w:t>
-      </w:r>
-      <w:r>
-        <w:t xml:space="preserve">Fig. 4 </w:t>
-      </w:r>
-      <w:r>
-        <w:t>r</w:t>
-      </w:r>
-      <w:r>
-        <w:t>egime-conditioned AUC heatmap</w:t>
-      </w:r>
-      <w:r>
-        <w:t xml:space="preserve"> is shown</w:t>
-      </w:r>
-      <w:r>
-        <w:t>. The 21-day High-VIX cell shows the only material threshold-free ranking advantage.</w:t>
-      </w:r>
+        <w:t>While, in Fig. 5 regime-conditioned AUC heatmap is shown. The 21-day High-VIX cell shows the only material threshold-free ranking advantage.</w:t>
+      </w:r>
+      <w:r/>
+      <w:r/>
+      <w:r/>
+      <w:r/>
+      <w:r/>
     </w:p>
     <w:p>
       <w:pPr>
@@ -5447,7 +5427,7 @@
           <w:iCs/>
           <w:sz w:val="20"/>
         </w:rPr>
-        <w:t>Fig. 4. Regime-conditioned AUC heatmap.</w:t>
+        <w:t>Fig. 5. Regime-conditioned AUC heatmap.</w:t>
       </w:r>
     </w:p>
     <w:p>
@@ -5499,14 +5479,13 @@
           <w:iCs/>
           <w:sz w:val="20"/>
         </w:rPr>
-        <w:t>Table 8. Trading performance of the selective deployment rule versus benchmark strategies on the held-out test period</w:t>
+        <w:t>Table 9. Trading performance of the selective deployment rule versus benchmark strategies on the held-out test period.</w:t>
       </w:r>
       <w:r>
         <w:rPr>
           <w:i/>
           <w:sz w:val="20"/>
         </w:rPr>
-        <w:t>.</w:t>
       </w:r>
     </w:p>
     <w:tbl>
@@ -6074,7 +6053,7 @@
     <w:p/>
     <w:p>
       <w:r>
-        <w:t>Fig. 5 displays equity curves for benchmark and regime-filtered strategies under the corrected P2 trading simulation. The selective strategy compounds over fewer active days and exhibits lower realized drawdown, while buy-and-hold retains higher Sharpe in this corrected sample.</w:t>
+        <w:t>Fig. 6 displays equity curves for benchmark and regime-filtered strategies under the corrected P2 trading simulation. The selective strategy compounds over fewer active days and exhibits lower realized drawdown, while buy-and-hold retains higher Sharpe in this corrected sample.</w:t>
       </w:r>
     </w:p>
     <w:p>
@@ -6137,7 +6116,7 @@
           <w:iCs/>
           <w:sz w:val="20"/>
         </w:rPr>
-        <w:t>Fig. 5. Equity curves for benchmark and regime-filtered strategies.</w:t>
+        <w:t>Fig. 6. Equity curves for benchmark and regime-filtered strategies.</w:t>
       </w:r>
     </w:p>
     <w:p/>
@@ -6200,7 +6179,7 @@
           <w:iCs/>
           <w:sz w:val="20"/>
         </w:rPr>
-        <w:t>Fig. 6. Drawdown profiles.</w:t>
+        <w:t>Fig. 7. Drawdown profiles.</w:t>
       </w:r>
     </w:p>
     <w:p>
@@ -6275,7 +6254,7 @@
     </w:p>
     <w:p>
       <w:r>
-        <w:t>Fig. 11. Regime-specific SHAP feature importance (mean |SHAP|, XGBoost, 21-day horizon; High-VIX n=8, Low-VIX n=248).</w:t>
+        <w:t>Fig. 8. Regime-specific SHAP feature importance (mean |SHAP|, XGBoost, 21-day horizon; High-VIX n=8, Low-VIX n=248).</w:t>
       </w:r>
     </w:p>
     <w:p>
@@ -6364,7 +6343,7 @@
           <w:iCs/>
           <w:sz w:val="20"/>
         </w:rPr>
-        <w:t>Table 9. Transaction-cost sensitivity of the High-VIX plus Up deployment rule.</w:t>
+        <w:t>Table 10. Transaction-cost sensitivity of the High-VIX plus Up deployment rule.</w:t>
       </w:r>
     </w:p>
     <w:tbl>
@@ -7224,7 +7203,7 @@
           <w:iCs/>
           <w:sz w:val="20"/>
         </w:rPr>
-        <w:t>Fig. 7. Sharpe ratio and drawdown sensitivity of the High-VIX plus Up strategy under rising round-trip trading costs.</w:t>
+        <w:t>Fig. 9. Sharpe ratio and drawdown sensitivity of the High-VIX plus Up strategy under rising round-trip trading costs.</w:t>
       </w:r>
     </w:p>
     <w:p>
@@ -7258,7 +7237,7 @@
         <w:ind w:firstLine="360"/>
       </w:pPr>
       <w:r>
-        <w:t>The interpretation is more tentative than in the previous draft. Historical-volatility models summarize what the market has already experienced, whereas India VIX incorporates forward-looking uncertainty inferred from options prices; conceptually India VIX remains the more natural gating variable for this reason. Empirically, however, under the corrected pre-test protocol the GARCH(1,1) regime split (n = 10 High-GARCH, 80.0% accuracy) is no more statistically supported than the VIX split (n = 8, 100.0% accuracy): both non-overlapping Fisher tests return p = 1.000. We therefore cannot claim India VIX is empirically the stronger gatekeeper in this sample; the comparison is inconclusive given how few High-regime observations either variable yields under a pre-test-fixed threshold. Table 10 reports both regime splits and their intersection.</w:t>
+        <w:t>The interpretation is more tentative than in the previous draft. Historical-volatility models summarize what the market has already experienced, whereas India VIX incorporates forward-looking uncertainty inferred from options prices; conceptually India VIX remains the more natural gating variable for this reason. Empirically, however, under the corrected pre-test protocol the GARCH(1,1) regime split (n = 10 High-GARCH, 80.0% accuracy) is no more statistically supported than the VIX split (n = 8, 100.0% accuracy): both non-overlapping Fisher tests return p = 1.000. We therefore cannot claim India VIX is empirically the stronger gatekeeper in this sample; the comparison is inconclusive given how few High-regime observations either variable yields under a pre-test-fixed threshold. Table 11 reports both regime splits and their intersection.</w:t>
       </w:r>
       <w:r/>
       <w:r/>
@@ -7278,7 +7257,7 @@
           <w:iCs/>
           <w:sz w:val="20"/>
         </w:rPr>
-        <w:t>Table 10. India VIX regime versus GARCH(1,1) regime at the 21-day horizon.</w:t>
+        <w:t>Table 11. India VIX regime versus GARCH(1,1) regime at the 21-day horizon.</w:t>
       </w:r>
     </w:p>
     <w:tbl>
@@ -7732,7 +7711,7 @@
     <w:p/>
     <w:p>
       <w:r>
-        <w:t>Fig. 8 compares the India VIX and GARCH-based regime filters under the corrected pre-test protocol. Neither split reaches statistical significance (Fisher p = 1.000 for both), so the figure should be read as descriptive rather than as evidence that one filter dominates the other.</w:t>
+        <w:t>Fig. 10 compares the India VIX and GARCH-based regime filters under the corrected pre-test protocol. Neither split reaches statistical significance (Fisher p = 1.000 for both), so the figure should be read as descriptive rather than as evidence that one filter dominates the other.</w:t>
       </w:r>
       <w:r/>
       <w:r/>
@@ -7798,7 +7777,7 @@
           <w:iCs/>
           <w:sz w:val="20"/>
         </w:rPr>
-        <w:t>Fig. 8. Comparison of India VIX and GARCH-based regime filters.</w:t>
+        <w:t>Fig. 10. Comparison of India VIX and GARCH-based regime filters.</w:t>
       </w:r>
     </w:p>
     <w:p>
@@ -7857,7 +7836,7 @@
           <w:iCs/>
           <w:sz w:val="20"/>
         </w:rPr>
-        <w:t>Table 11. Threshold sensitivity and quarterly concentration of the High-VIX subset under the corrected pre-test protocol.</w:t>
+        <w:t>Table 12. Threshold sensitivity and quarterly concentration of the High-VIX subset under the corrected pre-test protocol.</w:t>
       </w:r>
     </w:p>
     <w:tbl>
@@ -8309,7 +8288,7 @@
     </w:p>
     <w:p>
       <w:r>
-        <w:t>Fig. 9 highlights dependence-aware uncertainty diagnostics and temporal concentration of the High-VIX subset. The figure is interpreted as evidence of conditional separation with limited inferential strength under sparse high-volatility support.</w:t>
+        <w:t>Fig. 11 highlights dependence-aware uncertainty diagnostics and temporal concentration of the High-VIX subset. The figure is interpreted as evidence of conditional separation with limited inferential strength under sparse high-volatility support.</w:t>
       </w:r>
     </w:p>
     <w:p>
@@ -8371,7 +8350,7 @@
           <w:iCs/>
           <w:sz w:val="20"/>
         </w:rPr>
-        <w:t xml:space="preserve">Fig. 9. Bootstrap confidence intervals and temporal concentration of the High-VIX result. </w:t>
+        <w:t xml:space="preserve">Fig. 11. Bootstrap confidence intervals and temporal concentration of the High-VIX result. </w:t>
       </w:r>
     </w:p>
     <w:p/>
@@ -8390,7 +8369,7 @@
     </w:p>
     <w:p>
       <w:r>
-        <w:t>Table 12. Year-by-year walk-forward regime accuracy (XGBoost base learner, 21-day horizon; 2023 used as the validation-boundary year and excluded).</w:t>
+        <w:t>Table 13. Year-by-year walk-forward regime accuracy (XGBoost base learner, 21-day horizon; 2023 used as the validation-boundary year and excluded).</w:t>
       </w:r>
     </w:p>
     <w:tbl>
@@ -9027,7 +9006,7 @@
     </w:p>
     <w:p>
       <w:r>
-        <w:t>Table 13. Ablation study: accuracy by model configuration and regime (21-day horizon).</w:t>
+        <w:t>Table 14. Ablation study: accuracy by model configuration and regime (21-day horizon).</w:t>
       </w:r>
     </w:p>
     <w:tbl>
@@ -9460,7 +9439,7 @@
     </w:p>
     <w:p>
       <w:r>
-        <w:t>Fig. 13. Ablation study: High-VIX accuracy by configuration. Not informative on its own (n=8, single class) -- see Table 13 for the Low-VIX and Overall columns, which are the meaningful comparison for this ablation.</w:t>
+        <w:t>Fig. 13. Ablation study: High-VIX accuracy by configuration. Not informative on its own (n=8, single class) -- see Table 14 for the Low-VIX and Overall columns, which are the meaningful comparison for this ablation.</w:t>
       </w:r>
     </w:p>
     <w:p>
@@ -9494,7 +9473,7 @@
         <w:ind w:firstLine="360"/>
       </w:pPr>
       <w:r>
-        <w:t>This interpretation is complicated by the 1-day and 5-day results (Section 5.1, Table 7). The 1-day horizon shows no regime gap, consistent with a "noise dominates at short horizons" story. The 5-day horizon, however, shows a nominally larger High-VIX accuracy gap than even the 21-day headline result (100.0% vs 55.2%, uncorrected Fisher p=0.011) on the same eight High-VIX test days. We do not read this as evidence that a genuine effect exists at 5-day and not at 21-day, or vice versa; with only eight shared High-VIX observations across all three horizons and no independent block-bootstrap or walk-forward validation for 1-day/5-day, the more honest reading is that all three horizon-conditional results are heavily influenced by the same small, single-episode sample, and none of them should be treated as horizon-specific mechanistic evidence. This further supports the paper's overall conclusion (Section 6.4) that the primary finding does not generalize reliably beyond the evaluated episode.</w:t>
+        <w:t>This interpretation is complicated by the 1-day and 5-day results (Section 5.1, Table 8). The 1-day horizon shows no regime gap, consistent with a "noise dominates at short horizons" story. The 5-day horizon, however, shows a nominally larger High-VIX accuracy gap than even the 21-day headline result (100.0% vs 55.2%, uncorrected Fisher p=0.011) on the same eight High-VIX test days. We do not read this as evidence that a genuine effect exists at 5-day and not at 21-day, or vice versa; with only eight shared High-VIX observations across all three horizons and no independent block-bootstrap or walk-forward validation for 1-day/5-day, the more honest reading is that all three horizon-conditional results are heavily influenced by the same small, single-episode sample, and none of them should be treated as horizon-specific mechanistic evidence. This further supports the paper's overall conclusion (Section 6.4) that the primary finding does not generalize reliably beyond the evaluated episode.</w:t>
       </w:r>
     </w:p>
     <w:p>

</xml_diff>

<commit_message>
Full read-through pass: fix 3 remaining stale claims in Figs 4/5 captions and Section 7's deployment-rule paragraph, now consistent with the walk-forward non-replication finding
</commit_message>
<xml_diff>
--- a/Manuscript/Major_Revision_02_/Manuscript_26082026.docx
+++ b/Manuscript/Major_Revision_02_/Manuscript_26082026.docx
@@ -5283,7 +5283,7 @@
     <w:p/>
     <w:p>
       <w:r>
-        <w:t>In Fig. 4. regime-conditioned directional accuracy across 1-day, 5-day, and 21-day horizons for the stacking ensemble is shown. The effect appears only at the 21-day horizon.</w:t>
+        <w:t>Fig. 4 shows regime-conditioned directional accuracy across 1-day, 5-day, and 21-day horizons for the stacking ensemble. The High-VIX/Low-VIX gap is largest at 5-day and 21-day and near zero at 1-day, but as discussed in Section 7, this pattern rests on the same eight High-VIX observations at every horizon and should not be read as a clean horizon-specific effect.</w:t>
       </w:r>
       <w:r/>
       <w:r/>
@@ -5360,7 +5360,7 @@
     </w:p>
     <w:p>
       <w:r>
-        <w:t>While, in Fig. 5 regime-conditioned AUC heatmap is shown. The 21-day High-VIX cell shows the only material threshold-free ranking advantage.</w:t>
+        <w:t>While Fig. 5 shows a regime-conditioned AUC comparison across horizons. High-VIX AUC is undefined at 5-day and 21-day because the subset is single-class (n=8, all Up); at 1-day, where it is computable, it is 0.467 -- below chance. No horizon shows a material threshold-free ranking advantage in the High-VIX subset once AUC can actually be computed.</w:t>
       </w:r>
       <w:r/>
       <w:r/>
@@ -9482,18 +9482,11 @@
         <w:ind w:firstLine="360"/>
       </w:pPr>
       <w:r>
-        <w:t xml:space="preserve">For practical deployment, the study supports a narrow but actionable rule: trust the ensemble primarily when India VIX is in the upper quartile of the contemporaneous environment and the model predicts Up. That rule turns the architecture into an expert assistant rather than an autopilot. A trader or desk can remain in cash most of the time, monitor India VIX as a gating variable, and only deploy the directional model when the system’s measured reliability </w:t>
-      </w:r>
-      <w:r>
-        <w:lastRenderedPageBreak/>
-        <w:t xml:space="preserve">historically improved. </w:t>
-      </w:r>
-      <w:r>
-        <w:t>T</w:t>
-      </w:r>
-      <w:r>
-        <w:t>he value lies in the decision logic wrapped around the predictive engine, not just in the engine itself.</w:t>
-      </w:r>
+        <w:t>For practical deployment, the evidence in this paper does not support a validated actionable rule. A user could, in principle, restrict trust in the ensemble to periods when India VIX is in the upper quartile of the pre-test environment, but the walk-forward analysis (Section 6.4) shows this would have helped in only one of six evaluated years and hurt in the other five. We therefore stop short of recommending this as a deployment policy; the more defensible statement is that state-dependent trust filters of this kind are worth building and testing prospectively, with the sample-specific result reported here as a starting hypothesis rather than a validated rule.</w:t>
+      </w:r>
+      <w:r/>
+      <w:r/>
+      <w:r/>
     </w:p>
     <w:p>
       <w:pPr>

</xml_diff>